<commit_message>
Thêm tính năng quản lí các tab
Thêm tab mở đầu
</commit_message>
<xml_diff>
--- a/doc/photo_black.docx
+++ b/doc/photo_black.docx
@@ -212,6 +212,117 @@
           <w:lang w:val="vi-VN"/>
         </w:rPr>
         <w:lastRenderedPageBreak/>
+        <w:t xml:space="preserve">Định nghĩa: </w:t>
+      </w:r>
+    </w:p>
+    <w:p>
+      <w:pPr>
+        <w:rPr>
+          <w:rFonts w:ascii="Times New Roman" w:hAnsi="Times New Roman" w:cs="Times New Roman"/>
+          <w:sz w:val="32"/>
+          <w:szCs w:val="32"/>
+          <w:lang w:val="vi-VN"/>
+        </w:rPr>
+      </w:pPr>
+      <w:r>
+        <w:rPr>
+          <w:rFonts w:ascii="Times New Roman" w:hAnsi="Times New Roman" w:cs="Times New Roman"/>
+          <w:sz w:val="32"/>
+          <w:szCs w:val="32"/>
+          <w:lang w:val="vi-VN"/>
+        </w:rPr>
+        <w:t xml:space="preserve">Pixel (Điểm ảnh) : </w:t>
+      </w:r>
+      <w:r>
+        <w:rPr>
+          <w:rFonts w:ascii="Times New Roman" w:hAnsi="Times New Roman" w:cs="Times New Roman"/>
+          <w:sz w:val="32"/>
+          <w:szCs w:val="32"/>
+          <w:lang w:val="vi-VN"/>
+        </w:rPr>
+        <w:t xml:space="preserve">đơn vị cơ bản nhỏ nhất cấu thành nên một hình ảnh kỹ thuật số hoặc màn hình hiển </w:t>
+      </w:r>
+      <w:r>
+        <w:rPr>
+          <w:rFonts w:ascii="Times New Roman" w:hAnsi="Times New Roman" w:cs="Times New Roman"/>
+          <w:sz w:val="32"/>
+          <w:szCs w:val="32"/>
+          <w:lang w:val="vi-VN"/>
+        </w:rPr>
+        <w:t>thị. Theo chuẩn hiện đại, mỗi Pixel có màu sắc được biểu thị bởi 3 kênh</w:t>
+      </w:r>
+      <w:r>
+        <w:rPr>
+          <w:rFonts w:ascii="Times New Roman" w:hAnsi="Times New Roman" w:cs="Times New Roman"/>
+          <w:sz w:val="32"/>
+          <w:szCs w:val="32"/>
+          <w:lang w:val="vi-VN"/>
+        </w:rPr>
+        <w:t xml:space="preserve"> màu là 3 số nguyên</w:t>
+      </w:r>
+      <w:r>
+        <w:rPr>
+          <w:rFonts w:ascii="Times New Roman" w:hAnsi="Times New Roman" w:cs="Times New Roman"/>
+          <w:sz w:val="32"/>
+          <w:szCs w:val="32"/>
+          <w:lang w:val="vi-VN"/>
+        </w:rPr>
+        <w:t xml:space="preserve"> : R(đỏ), G(lục),</w:t>
+      </w:r>
+      <w:r>
+        <w:rPr>
+          <w:rFonts w:ascii="Times New Roman" w:hAnsi="Times New Roman" w:cs="Times New Roman"/>
+          <w:sz w:val="32"/>
+          <w:szCs w:val="32"/>
+          <w:lang w:val="vi-VN"/>
+        </w:rPr>
+        <w:t xml:space="preserve"> </w:t>
+      </w:r>
+      <w:r>
+        <w:rPr>
+          <w:rFonts w:ascii="Times New Roman" w:hAnsi="Times New Roman" w:cs="Times New Roman"/>
+          <w:sz w:val="32"/>
+          <w:szCs w:val="32"/>
+          <w:lang w:val="vi-VN"/>
+        </w:rPr>
+        <w:t>B(Lam)</w:t>
+      </w:r>
+      <w:r>
+        <w:rPr>
+          <w:rFonts w:ascii="Times New Roman" w:hAnsi="Times New Roman" w:cs="Times New Roman"/>
+          <w:sz w:val="32"/>
+          <w:szCs w:val="32"/>
+          <w:lang w:val="vi-VN"/>
+        </w:rPr>
+        <w:t xml:space="preserve">. </w:t>
+      </w:r>
+      <w:r>
+        <w:rPr>
+          <w:rFonts w:ascii="Times New Roman" w:hAnsi="Times New Roman" w:cs="Times New Roman"/>
+          <w:sz w:val="32"/>
+          <w:szCs w:val="32"/>
+          <w:lang w:val="vi-VN"/>
+        </w:rPr>
+        <w:t>Ở các bức ảnh trắng đen, trên lí thuyết, mọi điểm ảnh của nó có 3 kênh màu R,G,B có giá trị bằng nhau.</w:t>
+      </w:r>
+    </w:p>
+    <w:p>
+      <w:pPr>
+        <w:jc w:val="center"/>
+        <w:rPr>
+          <w:rFonts w:ascii="Times New Roman" w:hAnsi="Times New Roman" w:cs="Times New Roman"/>
+          <w:sz w:val="44"/>
+          <w:szCs w:val="44"/>
+          <w:lang w:val="vi-VN"/>
+        </w:rPr>
+      </w:pPr>
+      <w:r>
+        <w:rPr>
+          <w:rFonts w:ascii="Times New Roman" w:hAnsi="Times New Roman" w:cs="Times New Roman"/>
+          <w:sz w:val="44"/>
+          <w:szCs w:val="44"/>
+          <w:lang w:val="vi-VN"/>
+        </w:rPr>
         <w:t>Chương I. Thuật toán</w:t>
       </w:r>
     </w:p>
@@ -553,6 +664,7 @@
           <w:szCs w:val="32"/>
           <w:lang w:val="vi-VN"/>
         </w:rPr>
+        <w:lastRenderedPageBreak/>
         <w:t xml:space="preserve"> </w:t>
       </w:r>
       <w:r>
@@ -609,7 +721,6 @@
           <w:szCs w:val="32"/>
           <w:lang w:val="vi-VN"/>
         </w:rPr>
-        <w:lastRenderedPageBreak/>
         <w:t xml:space="preserve">Theo thống kê, vậy ta sẽ lấy E của phim </w:t>
       </w:r>
       <w:r>
@@ -733,25 +844,7 @@
             <w:szCs w:val="32"/>
             <w:lang w:val="vi-VN"/>
           </w:rPr>
-          <m:t>d</m:t>
-        </m:r>
-        <m:r>
-          <w:rPr>
-            <w:rFonts w:ascii="Cambria Math" w:hAnsi="Cambria Math" w:cs="Times New Roman"/>
-            <w:sz w:val="32"/>
-            <w:szCs w:val="32"/>
-            <w:lang w:val="vi-VN"/>
-          </w:rPr>
-          <m:t>&lt;</m:t>
-        </m:r>
-        <m:r>
-          <w:rPr>
-            <w:rFonts w:ascii="Cambria Math" w:hAnsi="Cambria Math" w:cs="Times New Roman"/>
-            <w:sz w:val="32"/>
-            <w:szCs w:val="32"/>
-            <w:lang w:val="vi-VN"/>
-          </w:rPr>
-          <m:t>E</m:t>
+          <m:t>d&lt;E</m:t>
         </m:r>
       </m:oMath>
       <w:r>
@@ -799,16 +892,7 @@
             <w:szCs w:val="32"/>
             <w:lang w:val="vi-VN"/>
           </w:rPr>
-          <m:t>d=</m:t>
-        </m:r>
-        <m:r>
-          <w:rPr>
-            <w:rFonts w:ascii="Cambria Math" w:hAnsi="Cambria Math" w:cs="Times New Roman"/>
-            <w:sz w:val="32"/>
-            <w:szCs w:val="32"/>
-            <w:lang w:val="vi-VN"/>
-          </w:rPr>
-          <m:t>|</m:t>
+          <m:t>d=|</m:t>
         </m:r>
         <m:sSub>
           <m:sSubPr>
@@ -1098,19 +1182,7 @@
                           <w:szCs w:val="32"/>
                           <w:lang w:val="vi-VN"/>
                         </w:rPr>
-                        <m:t>max</m:t>
-                      </m:r>
-                      <m:r>
-                        <m:rPr>
-                          <m:sty m:val="p"/>
-                        </m:rPr>
-                        <w:rPr>
-                          <w:rFonts w:ascii="Cambria Math" w:hAnsi="Cambria Math" w:cs="Times New Roman"/>
-                          <w:sz w:val="32"/>
-                          <w:szCs w:val="32"/>
-                          <w:lang w:val="vi-VN"/>
-                        </w:rPr>
-                        <m:t>⁡</m:t>
+                        <m:t>max⁡</m:t>
                       </m:r>
                       <m:r>
                         <w:rPr>
@@ -1552,6 +1624,1207 @@
     </w:p>
     <w:p>
       <w:pPr>
+        <w:rPr>
+          <w:rFonts w:ascii="Times New Roman" w:hAnsi="Times New Roman" w:cs="Times New Roman"/>
+          <w:sz w:val="32"/>
+          <w:szCs w:val="32"/>
+          <w:lang w:val="vi-VN"/>
+        </w:rPr>
+      </w:pPr>
+    </w:p>
+    <w:p>
+      <w:pPr>
+        <w:rPr>
+          <w:rFonts w:ascii="Times New Roman" w:hAnsi="Times New Roman" w:cs="Times New Roman"/>
+          <w:sz w:val="32"/>
+          <w:szCs w:val="32"/>
+          <w:lang w:val="vi-VN"/>
+        </w:rPr>
+      </w:pPr>
+    </w:p>
+    <w:p>
+      <w:pPr>
+        <w:rPr>
+          <w:rFonts w:ascii="Times New Roman" w:hAnsi="Times New Roman" w:cs="Times New Roman"/>
+          <w:sz w:val="40"/>
+          <w:szCs w:val="40"/>
+          <w:lang w:val="vi-VN"/>
+        </w:rPr>
+      </w:pPr>
+      <w:r>
+        <w:rPr>
+          <w:rFonts w:ascii="Times New Roman" w:hAnsi="Times New Roman" w:cs="Times New Roman"/>
+          <w:sz w:val="40"/>
+          <w:szCs w:val="40"/>
+          <w:lang w:val="vi-VN"/>
+        </w:rPr>
+        <w:lastRenderedPageBreak/>
+        <w:t xml:space="preserve">Phần </w:t>
+      </w:r>
+      <w:r>
+        <w:rPr>
+          <w:rFonts w:ascii="Times New Roman" w:hAnsi="Times New Roman" w:cs="Times New Roman"/>
+          <w:sz w:val="40"/>
+          <w:szCs w:val="40"/>
+          <w:lang w:val="vi-VN"/>
+        </w:rPr>
+        <w:t>2</w:t>
+      </w:r>
+      <w:r>
+        <w:rPr>
+          <w:rFonts w:ascii="Times New Roman" w:hAnsi="Times New Roman" w:cs="Times New Roman"/>
+          <w:sz w:val="40"/>
+          <w:szCs w:val="40"/>
+          <w:lang w:val="vi-VN"/>
+        </w:rPr>
+        <w:t xml:space="preserve">. Thuật toán </w:t>
+      </w:r>
+      <w:r>
+        <w:rPr>
+          <w:rFonts w:ascii="Times New Roman" w:hAnsi="Times New Roman" w:cs="Times New Roman"/>
+          <w:sz w:val="40"/>
+          <w:szCs w:val="40"/>
+          <w:lang w:val="vi-VN"/>
+        </w:rPr>
+        <w:t>sửa màu</w:t>
+      </w:r>
+      <w:r>
+        <w:rPr>
+          <w:rFonts w:ascii="Times New Roman" w:hAnsi="Times New Roman" w:cs="Times New Roman"/>
+          <w:sz w:val="40"/>
+          <w:szCs w:val="40"/>
+          <w:lang w:val="vi-VN"/>
+        </w:rPr>
+        <w:t xml:space="preserve"> </w:t>
+      </w:r>
+    </w:p>
+    <w:p>
+      <w:pPr>
+        <w:rPr>
+          <w:rFonts w:ascii="Times New Roman" w:hAnsi="Times New Roman" w:cs="Times New Roman"/>
+          <w:b/>
+          <w:bCs/>
+          <w:sz w:val="32"/>
+          <w:szCs w:val="32"/>
+          <w:lang w:val="vi-VN"/>
+        </w:rPr>
+      </w:pPr>
+      <w:r>
+        <w:rPr>
+          <w:rFonts w:ascii="Times New Roman" w:hAnsi="Times New Roman" w:cs="Times New Roman"/>
+          <w:b/>
+          <w:bCs/>
+          <w:sz w:val="32"/>
+          <w:szCs w:val="32"/>
+          <w:lang w:val="vi-VN"/>
+        </w:rPr>
+        <w:t>I. Ý tưởng</w:t>
+      </w:r>
+      <w:r>
+        <w:rPr>
+          <w:rFonts w:ascii="Times New Roman" w:hAnsi="Times New Roman" w:cs="Times New Roman"/>
+          <w:b/>
+          <w:bCs/>
+          <w:sz w:val="32"/>
+          <w:szCs w:val="32"/>
+          <w:lang w:val="vi-VN"/>
+        </w:rPr>
+        <w:t xml:space="preserve"> </w:t>
+      </w:r>
+    </w:p>
+    <w:p>
+      <w:pPr>
+        <w:rPr>
+          <w:rFonts w:ascii="Times New Roman" w:hAnsi="Times New Roman" w:cs="Times New Roman"/>
+          <w:sz w:val="32"/>
+          <w:szCs w:val="32"/>
+          <w:lang w:val="vi-VN"/>
+        </w:rPr>
+      </w:pPr>
+      <w:r>
+        <w:rPr>
+          <w:rFonts w:ascii="Times New Roman" w:hAnsi="Times New Roman" w:cs="Times New Roman"/>
+          <w:sz w:val="32"/>
+          <w:szCs w:val="32"/>
+          <w:lang w:val="vi-VN"/>
+        </w:rPr>
+        <w:t xml:space="preserve">Trên thực tế, </w:t>
+      </w:r>
+      <w:r>
+        <w:rPr>
+          <w:rFonts w:ascii="Times New Roman" w:hAnsi="Times New Roman" w:cs="Times New Roman"/>
+          <w:sz w:val="32"/>
+          <w:szCs w:val="32"/>
+          <w:lang w:val="vi-VN"/>
+        </w:rPr>
+        <w:t xml:space="preserve">các tấm ảnh </w:t>
+      </w:r>
+      <w:r>
+        <w:rPr>
+          <w:rFonts w:ascii="Times New Roman" w:hAnsi="Times New Roman" w:cs="Times New Roman"/>
+          <w:sz w:val="32"/>
+          <w:szCs w:val="32"/>
+          <w:lang w:val="vi-VN"/>
+        </w:rPr>
+        <w:t xml:space="preserve">trắng đen </w:t>
+      </w:r>
+      <w:r>
+        <w:rPr>
+          <w:rFonts w:ascii="Times New Roman" w:hAnsi="Times New Roman" w:cs="Times New Roman"/>
+          <w:sz w:val="32"/>
+          <w:szCs w:val="32"/>
+          <w:lang w:val="vi-VN"/>
+        </w:rPr>
+        <w:t xml:space="preserve">được lưu trữ </w:t>
+      </w:r>
+      <w:r>
+        <w:rPr>
+          <w:rFonts w:ascii="Times New Roman" w:hAnsi="Times New Roman" w:cs="Times New Roman"/>
+          <w:sz w:val="32"/>
+          <w:szCs w:val="32"/>
+          <w:lang w:val="vi-VN"/>
+        </w:rPr>
+        <w:t xml:space="preserve">thường có vài </w:t>
+      </w:r>
+      <w:r>
+        <w:rPr>
+          <w:rFonts w:ascii="Times New Roman" w:hAnsi="Times New Roman" w:cs="Times New Roman"/>
+          <w:sz w:val="32"/>
+          <w:szCs w:val="32"/>
+          <w:lang w:val="vi-VN"/>
+        </w:rPr>
+        <w:t>Pixel có các giá trị R,G,B không bằng nhau ( do sai số kĩ thuật thiết bị hoặc do ố vàng)</w:t>
+      </w:r>
+      <w:r>
+        <w:rPr>
+          <w:rFonts w:ascii="Times New Roman" w:hAnsi="Times New Roman" w:cs="Times New Roman"/>
+          <w:sz w:val="32"/>
+          <w:szCs w:val="32"/>
+          <w:lang w:val="vi-VN"/>
+        </w:rPr>
+        <w:t xml:space="preserve">. </w:t>
+      </w:r>
+      <w:r>
+        <w:rPr>
+          <w:rFonts w:ascii="Times New Roman" w:hAnsi="Times New Roman" w:cs="Times New Roman"/>
+          <w:sz w:val="32"/>
+          <w:szCs w:val="32"/>
+          <w:lang w:val="vi-VN"/>
+        </w:rPr>
+        <w:br/>
+        <w:t xml:space="preserve">Điều đó đòi hỏi một công thức để sửa lại màu sắc các Pixel này về dạng trắng đen chuẩn trên lí thuyết để tiếp tục áp dụng các công thức khác. </w:t>
+      </w:r>
+    </w:p>
+    <w:p>
+      <w:pPr>
+        <w:rPr>
+          <w:rFonts w:ascii="Times New Roman" w:hAnsi="Times New Roman" w:cs="Times New Roman"/>
+          <w:b/>
+          <w:bCs/>
+          <w:sz w:val="32"/>
+          <w:szCs w:val="32"/>
+          <w:lang w:val="vi-VN"/>
+        </w:rPr>
+      </w:pPr>
+      <w:r>
+        <w:rPr>
+          <w:rFonts w:ascii="Times New Roman" w:hAnsi="Times New Roman" w:cs="Times New Roman"/>
+          <w:b/>
+          <w:bCs/>
+          <w:sz w:val="32"/>
+          <w:szCs w:val="32"/>
+          <w:lang w:val="vi-VN"/>
+        </w:rPr>
+        <w:t xml:space="preserve">II. Công thức </w:t>
+      </w:r>
+    </w:p>
+    <w:p>
+      <w:pPr>
+        <w:rPr>
+          <w:rFonts w:ascii="Times New Roman" w:hAnsi="Times New Roman" w:cs="Times New Roman"/>
+          <w:sz w:val="32"/>
+          <w:szCs w:val="32"/>
+          <w:lang w:val="vi-VN"/>
+        </w:rPr>
+      </w:pPr>
+      <w:r>
+        <w:rPr>
+          <w:rFonts w:ascii="Times New Roman" w:hAnsi="Times New Roman" w:cs="Times New Roman"/>
+          <w:sz w:val="32"/>
+          <w:szCs w:val="32"/>
+          <w:lang w:val="vi-VN"/>
+        </w:rPr>
+        <w:t xml:space="preserve">Dựa trên tính chất </w:t>
+      </w:r>
+      <w:r>
+        <w:rPr>
+          <w:rFonts w:ascii="Times New Roman" w:hAnsi="Times New Roman" w:cs="Times New Roman"/>
+          <w:sz w:val="32"/>
+          <w:szCs w:val="32"/>
+          <w:lang w:val="vi-VN"/>
+        </w:rPr>
+        <w:t>của các Pixel trên một tấm ảnh đen trắng trên lý thuyết ( Các kênh màu bằng nhau</w:t>
+      </w:r>
+      <w:r>
+        <w:rPr>
+          <w:rFonts w:ascii="Times New Roman" w:hAnsi="Times New Roman" w:cs="Times New Roman"/>
+          <w:sz w:val="32"/>
+          <w:szCs w:val="32"/>
+          <w:lang w:val="vi-VN"/>
+        </w:rPr>
+        <w:t xml:space="preserve"> </w:t>
+      </w:r>
+      <w:r>
+        <w:rPr>
+          <w:rFonts w:ascii="Times New Roman" w:hAnsi="Times New Roman" w:cs="Times New Roman"/>
+          <w:sz w:val="32"/>
+          <w:szCs w:val="32"/>
+          <w:lang w:val="vi-VN"/>
+        </w:rPr>
+        <w:t>)</w:t>
+      </w:r>
+      <w:r>
+        <w:rPr>
+          <w:rFonts w:ascii="Times New Roman" w:hAnsi="Times New Roman" w:cs="Times New Roman"/>
+          <w:sz w:val="32"/>
+          <w:szCs w:val="32"/>
+          <w:lang w:val="vi-VN"/>
+        </w:rPr>
+        <w:t xml:space="preserve">, ta có công thức </w:t>
+      </w:r>
+    </w:p>
+    <w:p>
+      <w:pPr>
+        <w:rPr>
+          <w:rFonts w:ascii="Times New Roman" w:eastAsiaTheme="minorEastAsia" w:hAnsi="Times New Roman" w:cs="Times New Roman"/>
+          <w:iCs/>
+          <w:sz w:val="32"/>
+          <w:szCs w:val="32"/>
+          <w:lang w:val="vi-VN"/>
+        </w:rPr>
+      </w:pPr>
+      <m:oMathPara>
+        <m:oMath>
+          <m:r>
+            <m:rPr>
+              <m:sty m:val="p"/>
+            </m:rPr>
+            <w:rPr>
+              <w:rFonts w:ascii="Cambria Math" w:hAnsi="Cambria Math" w:cs="Times New Roman"/>
+              <w:sz w:val="32"/>
+              <w:szCs w:val="32"/>
+              <w:lang w:val="vi-VN"/>
+            </w:rPr>
+            <m:t>L=</m:t>
+          </m:r>
+          <m:r>
+            <m:rPr>
+              <m:sty m:val="p"/>
+            </m:rPr>
+            <w:rPr>
+              <w:rFonts w:ascii="Cambria Math" w:hAnsi="Cambria Math" w:cs="Times New Roman"/>
+              <w:sz w:val="32"/>
+              <w:szCs w:val="32"/>
+              <w:lang w:val="vi-VN"/>
+            </w:rPr>
+            <m:t>min(</m:t>
+          </m:r>
+          <m:d>
+            <m:dPr>
+              <m:begChr m:val="⌊"/>
+              <m:endChr m:val="⌋"/>
+              <m:ctrlPr>
+                <w:rPr>
+                  <w:rFonts w:ascii="Cambria Math" w:hAnsi="Cambria Math" w:cs="Times New Roman"/>
+                  <w:iCs/>
+                  <w:sz w:val="32"/>
+                  <w:szCs w:val="32"/>
+                  <w:lang w:val="vi-VN"/>
+                </w:rPr>
+              </m:ctrlPr>
+            </m:dPr>
+            <m:e>
+              <m:sSub>
+                <m:sSubPr>
+                  <m:ctrlPr>
+                    <w:rPr>
+                      <w:rFonts w:ascii="Cambria Math" w:hAnsi="Cambria Math" w:cs="Times New Roman"/>
+                      <w:iCs/>
+                      <w:sz w:val="32"/>
+                      <w:szCs w:val="32"/>
+                      <w:lang w:val="vi-VN"/>
+                    </w:rPr>
+                  </m:ctrlPr>
+                </m:sSubPr>
+                <m:e>
+                  <m:r>
+                    <w:rPr>
+                      <w:rFonts w:ascii="Cambria Math" w:hAnsi="Cambria Math" w:cs="Times New Roman"/>
+                      <w:sz w:val="32"/>
+                      <w:szCs w:val="32"/>
+                      <w:lang w:val="vi-VN"/>
+                    </w:rPr>
+                    <m:t>F</m:t>
+                  </m:r>
+                </m:e>
+                <m:sub>
+                  <m:r>
+                    <w:rPr>
+                      <w:rFonts w:ascii="Cambria Math" w:hAnsi="Cambria Math" w:cs="Times New Roman"/>
+                      <w:sz w:val="32"/>
+                      <w:szCs w:val="32"/>
+                      <w:lang w:val="vi-VN"/>
+                    </w:rPr>
+                    <m:t>R</m:t>
+                  </m:r>
+                </m:sub>
+              </m:sSub>
+              <m:sSub>
+                <m:sSubPr>
+                  <m:ctrlPr>
+                    <w:rPr>
+                      <w:rFonts w:ascii="Cambria Math" w:hAnsi="Cambria Math" w:cs="Times New Roman"/>
+                      <w:iCs/>
+                      <w:sz w:val="32"/>
+                      <w:szCs w:val="32"/>
+                      <w:lang w:val="vi-VN"/>
+                    </w:rPr>
+                  </m:ctrlPr>
+                </m:sSubPr>
+                <m:e>
+                  <m:r>
+                    <w:rPr>
+                      <w:rFonts w:ascii="Cambria Math" w:hAnsi="Cambria Math" w:cs="Times New Roman"/>
+                      <w:sz w:val="32"/>
+                      <w:szCs w:val="32"/>
+                      <w:lang w:val="vi-VN"/>
+                    </w:rPr>
+                    <m:t>P</m:t>
+                  </m:r>
+                </m:e>
+                <m:sub>
+                  <m:r>
+                    <w:rPr>
+                      <w:rFonts w:ascii="Cambria Math" w:hAnsi="Cambria Math" w:cs="Times New Roman"/>
+                      <w:sz w:val="32"/>
+                      <w:szCs w:val="32"/>
+                      <w:lang w:val="vi-VN"/>
+                    </w:rPr>
+                    <m:t>R</m:t>
+                  </m:r>
+                </m:sub>
+              </m:sSub>
+            </m:e>
+          </m:d>
+          <m:r>
+            <m:rPr>
+              <m:sty m:val="p"/>
+            </m:rPr>
+            <w:rPr>
+              <w:rFonts w:ascii="Cambria Math" w:hAnsi="Cambria Math" w:cs="Times New Roman"/>
+              <w:sz w:val="32"/>
+              <w:szCs w:val="32"/>
+              <w:lang w:val="vi-VN"/>
+            </w:rPr>
+            <m:t>,</m:t>
+          </m:r>
+          <m:d>
+            <m:dPr>
+              <m:begChr m:val="⌊"/>
+              <m:endChr m:val="⌋"/>
+              <m:ctrlPr>
+                <w:rPr>
+                  <w:rFonts w:ascii="Cambria Math" w:hAnsi="Cambria Math" w:cs="Times New Roman"/>
+                  <w:iCs/>
+                  <w:sz w:val="32"/>
+                  <w:szCs w:val="32"/>
+                  <w:lang w:val="vi-VN"/>
+                </w:rPr>
+              </m:ctrlPr>
+            </m:dPr>
+            <m:e>
+              <m:sSub>
+                <m:sSubPr>
+                  <m:ctrlPr>
+                    <w:rPr>
+                      <w:rFonts w:ascii="Cambria Math" w:hAnsi="Cambria Math" w:cs="Times New Roman"/>
+                      <w:iCs/>
+                      <w:sz w:val="32"/>
+                      <w:szCs w:val="32"/>
+                      <w:lang w:val="vi-VN"/>
+                    </w:rPr>
+                  </m:ctrlPr>
+                </m:sSubPr>
+                <m:e>
+                  <m:r>
+                    <w:rPr>
+                      <w:rFonts w:ascii="Cambria Math" w:hAnsi="Cambria Math" w:cs="Times New Roman"/>
+                      <w:sz w:val="32"/>
+                      <w:szCs w:val="32"/>
+                      <w:lang w:val="vi-VN"/>
+                    </w:rPr>
+                    <m:t>F</m:t>
+                  </m:r>
+                </m:e>
+                <m:sub>
+                  <m:r>
+                    <w:rPr>
+                      <w:rFonts w:ascii="Cambria Math" w:hAnsi="Cambria Math" w:cs="Times New Roman"/>
+                      <w:sz w:val="32"/>
+                      <w:szCs w:val="32"/>
+                      <w:lang w:val="vi-VN"/>
+                    </w:rPr>
+                    <m:t>G</m:t>
+                  </m:r>
+                </m:sub>
+              </m:sSub>
+              <m:sSub>
+                <m:sSubPr>
+                  <m:ctrlPr>
+                    <w:rPr>
+                      <w:rFonts w:ascii="Cambria Math" w:hAnsi="Cambria Math" w:cs="Times New Roman"/>
+                      <w:iCs/>
+                      <w:sz w:val="32"/>
+                      <w:szCs w:val="32"/>
+                      <w:lang w:val="vi-VN"/>
+                    </w:rPr>
+                  </m:ctrlPr>
+                </m:sSubPr>
+                <m:e>
+                  <m:r>
+                    <w:rPr>
+                      <w:rFonts w:ascii="Cambria Math" w:hAnsi="Cambria Math" w:cs="Times New Roman"/>
+                      <w:sz w:val="32"/>
+                      <w:szCs w:val="32"/>
+                      <w:lang w:val="vi-VN"/>
+                    </w:rPr>
+                    <m:t>P</m:t>
+                  </m:r>
+                </m:e>
+                <m:sub>
+                  <m:r>
+                    <w:rPr>
+                      <w:rFonts w:ascii="Cambria Math" w:hAnsi="Cambria Math" w:cs="Times New Roman"/>
+                      <w:sz w:val="32"/>
+                      <w:szCs w:val="32"/>
+                      <w:lang w:val="vi-VN"/>
+                    </w:rPr>
+                    <m:t>G</m:t>
+                  </m:r>
+                </m:sub>
+              </m:sSub>
+            </m:e>
+          </m:d>
+          <m:r>
+            <m:rPr>
+              <m:sty m:val="p"/>
+            </m:rPr>
+            <w:rPr>
+              <w:rFonts w:ascii="Cambria Math" w:hAnsi="Cambria Math" w:cs="Times New Roman"/>
+              <w:sz w:val="32"/>
+              <w:szCs w:val="32"/>
+              <w:lang w:val="vi-VN"/>
+            </w:rPr>
+            <m:t>,</m:t>
+          </m:r>
+          <m:d>
+            <m:dPr>
+              <m:begChr m:val="⌊"/>
+              <m:endChr m:val="⌋"/>
+              <m:ctrlPr>
+                <w:rPr>
+                  <w:rFonts w:ascii="Cambria Math" w:hAnsi="Cambria Math" w:cs="Times New Roman"/>
+                  <w:iCs/>
+                  <w:sz w:val="32"/>
+                  <w:szCs w:val="32"/>
+                  <w:lang w:val="vi-VN"/>
+                </w:rPr>
+              </m:ctrlPr>
+            </m:dPr>
+            <m:e>
+              <m:sSub>
+                <m:sSubPr>
+                  <m:ctrlPr>
+                    <w:rPr>
+                      <w:rFonts w:ascii="Cambria Math" w:hAnsi="Cambria Math" w:cs="Times New Roman"/>
+                      <w:iCs/>
+                      <w:sz w:val="32"/>
+                      <w:szCs w:val="32"/>
+                      <w:lang w:val="vi-VN"/>
+                    </w:rPr>
+                  </m:ctrlPr>
+                </m:sSubPr>
+                <m:e>
+                  <m:r>
+                    <w:rPr>
+                      <w:rFonts w:ascii="Cambria Math" w:hAnsi="Cambria Math" w:cs="Times New Roman"/>
+                      <w:sz w:val="32"/>
+                      <w:szCs w:val="32"/>
+                      <w:lang w:val="vi-VN"/>
+                    </w:rPr>
+                    <m:t>F</m:t>
+                  </m:r>
+                </m:e>
+                <m:sub>
+                  <m:r>
+                    <w:rPr>
+                      <w:rFonts w:ascii="Cambria Math" w:hAnsi="Cambria Math" w:cs="Times New Roman"/>
+                      <w:sz w:val="32"/>
+                      <w:szCs w:val="32"/>
+                      <w:lang w:val="vi-VN"/>
+                    </w:rPr>
+                    <m:t>B</m:t>
+                  </m:r>
+                </m:sub>
+              </m:sSub>
+              <m:sSub>
+                <m:sSubPr>
+                  <m:ctrlPr>
+                    <w:rPr>
+                      <w:rFonts w:ascii="Cambria Math" w:hAnsi="Cambria Math" w:cs="Times New Roman"/>
+                      <w:iCs/>
+                      <w:sz w:val="32"/>
+                      <w:szCs w:val="32"/>
+                      <w:lang w:val="vi-VN"/>
+                    </w:rPr>
+                  </m:ctrlPr>
+                </m:sSubPr>
+                <m:e>
+                  <m:r>
+                    <w:rPr>
+                      <w:rFonts w:ascii="Cambria Math" w:hAnsi="Cambria Math" w:cs="Times New Roman"/>
+                      <w:sz w:val="32"/>
+                      <w:szCs w:val="32"/>
+                      <w:lang w:val="vi-VN"/>
+                    </w:rPr>
+                    <m:t>P</m:t>
+                  </m:r>
+                </m:e>
+                <m:sub>
+                  <m:r>
+                    <w:rPr>
+                      <w:rFonts w:ascii="Cambria Math" w:hAnsi="Cambria Math" w:cs="Times New Roman"/>
+                      <w:sz w:val="32"/>
+                      <w:szCs w:val="32"/>
+                      <w:lang w:val="vi-VN"/>
+                    </w:rPr>
+                    <m:t>B</m:t>
+                  </m:r>
+                </m:sub>
+              </m:sSub>
+            </m:e>
+          </m:d>
+          <m:r>
+            <m:rPr>
+              <m:sty m:val="p"/>
+            </m:rPr>
+            <w:rPr>
+              <w:rFonts w:ascii="Cambria Math" w:hAnsi="Cambria Math" w:cs="Times New Roman"/>
+              <w:sz w:val="32"/>
+              <w:szCs w:val="32"/>
+              <w:lang w:val="vi-VN"/>
+            </w:rPr>
+            <m:t>)</m:t>
+          </m:r>
+        </m:oMath>
+      </m:oMathPara>
+    </w:p>
+    <w:p>
+      <w:pPr>
+        <w:rPr>
+          <w:rFonts w:ascii="Times New Roman" w:eastAsiaTheme="minorEastAsia" w:hAnsi="Times New Roman" w:cs="Times New Roman"/>
+          <w:iCs/>
+          <w:sz w:val="32"/>
+          <w:szCs w:val="32"/>
+          <w:lang w:val="vi-VN"/>
+        </w:rPr>
+      </w:pPr>
+      <w:r>
+        <w:rPr>
+          <w:rFonts w:ascii="Times New Roman" w:eastAsiaTheme="minorEastAsia" w:hAnsi="Times New Roman" w:cs="Times New Roman"/>
+          <w:iCs/>
+          <w:sz w:val="32"/>
+          <w:szCs w:val="32"/>
+          <w:lang w:val="vi-VN"/>
+        </w:rPr>
+        <w:t>Trong đó :</w:t>
+      </w:r>
+    </w:p>
+    <w:p>
+      <w:pPr>
+        <w:rPr>
+          <w:rFonts w:ascii="Times New Roman" w:eastAsiaTheme="minorEastAsia" w:hAnsi="Times New Roman" w:cs="Times New Roman"/>
+          <w:iCs/>
+          <w:sz w:val="32"/>
+          <w:szCs w:val="32"/>
+          <w:lang w:val="vi-VN"/>
+        </w:rPr>
+      </w:pPr>
+      <m:oMath>
+        <m:sSub>
+          <m:sSubPr>
+            <m:ctrlPr>
+              <w:rPr>
+                <w:rFonts w:ascii="Cambria Math" w:hAnsi="Cambria Math" w:cs="Times New Roman"/>
+                <w:iCs/>
+                <w:sz w:val="32"/>
+                <w:szCs w:val="32"/>
+                <w:lang w:val="vi-VN"/>
+              </w:rPr>
+            </m:ctrlPr>
+          </m:sSubPr>
+          <m:e>
+            <m:r>
+              <w:rPr>
+                <w:rFonts w:ascii="Cambria Math" w:hAnsi="Cambria Math" w:cs="Times New Roman"/>
+                <w:sz w:val="32"/>
+                <w:szCs w:val="32"/>
+                <w:lang w:val="vi-VN"/>
+              </w:rPr>
+              <m:t>P</m:t>
+            </m:r>
+          </m:e>
+          <m:sub>
+            <m:r>
+              <w:rPr>
+                <w:rFonts w:ascii="Cambria Math" w:hAnsi="Cambria Math" w:cs="Times New Roman"/>
+                <w:sz w:val="32"/>
+                <w:szCs w:val="32"/>
+                <w:lang w:val="vi-VN"/>
+              </w:rPr>
+              <m:t>R</m:t>
+            </m:r>
+          </m:sub>
+        </m:sSub>
+      </m:oMath>
+      <w:r>
+        <w:rPr>
+          <w:rFonts w:ascii="Times New Roman" w:eastAsiaTheme="minorEastAsia" w:hAnsi="Times New Roman" w:cs="Times New Roman"/>
+          <w:iCs/>
+          <w:sz w:val="32"/>
+          <w:szCs w:val="32"/>
+          <w:lang w:val="vi-VN"/>
+        </w:rPr>
+        <w:t xml:space="preserve"> là kênh màu đỏ của màu cần sửa </w:t>
+      </w:r>
+    </w:p>
+    <w:p>
+      <w:pPr>
+        <w:rPr>
+          <w:rFonts w:ascii="Times New Roman" w:eastAsiaTheme="minorEastAsia" w:hAnsi="Times New Roman" w:cs="Times New Roman"/>
+          <w:iCs/>
+          <w:sz w:val="32"/>
+          <w:szCs w:val="32"/>
+          <w:lang w:val="vi-VN"/>
+        </w:rPr>
+      </w:pPr>
+      <m:oMath>
+        <m:sSub>
+          <m:sSubPr>
+            <m:ctrlPr>
+              <w:rPr>
+                <w:rFonts w:ascii="Cambria Math" w:hAnsi="Cambria Math" w:cs="Times New Roman"/>
+                <w:iCs/>
+                <w:sz w:val="32"/>
+                <w:szCs w:val="32"/>
+                <w:lang w:val="vi-VN"/>
+              </w:rPr>
+            </m:ctrlPr>
+          </m:sSubPr>
+          <m:e>
+            <m:r>
+              <w:rPr>
+                <w:rFonts w:ascii="Cambria Math" w:hAnsi="Cambria Math" w:cs="Times New Roman"/>
+                <w:sz w:val="32"/>
+                <w:szCs w:val="32"/>
+                <w:lang w:val="vi-VN"/>
+              </w:rPr>
+              <m:t>P</m:t>
+            </m:r>
+          </m:e>
+          <m:sub>
+            <m:r>
+              <w:rPr>
+                <w:rFonts w:ascii="Cambria Math" w:hAnsi="Cambria Math" w:cs="Times New Roman"/>
+                <w:sz w:val="32"/>
+                <w:szCs w:val="32"/>
+                <w:lang w:val="vi-VN"/>
+              </w:rPr>
+              <m:t>G</m:t>
+            </m:r>
+          </m:sub>
+        </m:sSub>
+      </m:oMath>
+      <w:r>
+        <w:rPr>
+          <w:rFonts w:ascii="Times New Roman" w:eastAsiaTheme="minorEastAsia" w:hAnsi="Times New Roman" w:cs="Times New Roman"/>
+          <w:iCs/>
+          <w:sz w:val="32"/>
+          <w:szCs w:val="32"/>
+          <w:lang w:val="vi-VN"/>
+        </w:rPr>
+        <w:t xml:space="preserve"> là kênh màu lục của màu cần sửa </w:t>
+      </w:r>
+    </w:p>
+    <w:p>
+      <w:pPr>
+        <w:rPr>
+          <w:rFonts w:ascii="Times New Roman" w:eastAsiaTheme="minorEastAsia" w:hAnsi="Times New Roman" w:cs="Times New Roman"/>
+          <w:iCs/>
+          <w:sz w:val="32"/>
+          <w:szCs w:val="32"/>
+          <w:lang w:val="vi-VN"/>
+        </w:rPr>
+      </w:pPr>
+      <m:oMath>
+        <m:sSub>
+          <m:sSubPr>
+            <m:ctrlPr>
+              <w:rPr>
+                <w:rFonts w:ascii="Cambria Math" w:hAnsi="Cambria Math" w:cs="Times New Roman"/>
+                <w:iCs/>
+                <w:sz w:val="32"/>
+                <w:szCs w:val="32"/>
+                <w:lang w:val="vi-VN"/>
+              </w:rPr>
+            </m:ctrlPr>
+          </m:sSubPr>
+          <m:e>
+            <m:r>
+              <w:rPr>
+                <w:rFonts w:ascii="Cambria Math" w:hAnsi="Cambria Math" w:cs="Times New Roman"/>
+                <w:sz w:val="32"/>
+                <w:szCs w:val="32"/>
+                <w:lang w:val="vi-VN"/>
+              </w:rPr>
+              <m:t>P</m:t>
+            </m:r>
+          </m:e>
+          <m:sub>
+            <m:r>
+              <w:rPr>
+                <w:rFonts w:ascii="Cambria Math" w:hAnsi="Cambria Math" w:cs="Times New Roman"/>
+                <w:sz w:val="32"/>
+                <w:szCs w:val="32"/>
+                <w:lang w:val="vi-VN"/>
+              </w:rPr>
+              <m:t>B</m:t>
+            </m:r>
+          </m:sub>
+        </m:sSub>
+      </m:oMath>
+      <w:r>
+        <w:rPr>
+          <w:rFonts w:ascii="Times New Roman" w:eastAsiaTheme="minorEastAsia" w:hAnsi="Times New Roman" w:cs="Times New Roman"/>
+          <w:iCs/>
+          <w:sz w:val="32"/>
+          <w:szCs w:val="32"/>
+          <w:lang w:val="vi-VN"/>
+        </w:rPr>
+        <w:t xml:space="preserve"> là kênh màu lam của màu cần sửa</w:t>
+      </w:r>
+    </w:p>
+    <w:p>
+      <w:pPr>
+        <w:rPr>
+          <w:rFonts w:ascii="Times New Roman" w:eastAsiaTheme="minorEastAsia" w:hAnsi="Times New Roman" w:cs="Times New Roman"/>
+          <w:iCs/>
+          <w:sz w:val="32"/>
+          <w:szCs w:val="32"/>
+          <w:lang w:val="vi-VN"/>
+        </w:rPr>
+      </w:pPr>
+      <m:oMath>
+        <m:sSub>
+          <m:sSubPr>
+            <m:ctrlPr>
+              <w:rPr>
+                <w:rFonts w:ascii="Cambria Math" w:hAnsi="Cambria Math" w:cs="Times New Roman"/>
+                <w:iCs/>
+                <w:sz w:val="32"/>
+                <w:szCs w:val="32"/>
+                <w:lang w:val="vi-VN"/>
+              </w:rPr>
+            </m:ctrlPr>
+          </m:sSubPr>
+          <m:e>
+            <m:r>
+              <w:rPr>
+                <w:rFonts w:ascii="Cambria Math" w:hAnsi="Cambria Math" w:cs="Times New Roman"/>
+                <w:sz w:val="32"/>
+                <w:szCs w:val="32"/>
+                <w:lang w:val="vi-VN"/>
+              </w:rPr>
+              <m:t>F</m:t>
+            </m:r>
+          </m:e>
+          <m:sub>
+            <m:r>
+              <w:rPr>
+                <w:rFonts w:ascii="Cambria Math" w:hAnsi="Cambria Math" w:cs="Times New Roman"/>
+                <w:sz w:val="32"/>
+                <w:szCs w:val="32"/>
+                <w:lang w:val="vi-VN"/>
+              </w:rPr>
+              <m:t>R</m:t>
+            </m:r>
+          </m:sub>
+        </m:sSub>
+        <m:r>
+          <w:rPr>
+            <w:rFonts w:ascii="Cambria Math" w:hAnsi="Cambria Math" w:cs="Times New Roman"/>
+            <w:sz w:val="32"/>
+            <w:szCs w:val="32"/>
+            <w:lang w:val="vi-VN"/>
+          </w:rPr>
+          <m:t>,</m:t>
+        </m:r>
+        <m:sSub>
+          <m:sSubPr>
+            <m:ctrlPr>
+              <w:rPr>
+                <w:rFonts w:ascii="Cambria Math" w:hAnsi="Cambria Math" w:cs="Times New Roman"/>
+                <w:iCs/>
+                <w:sz w:val="32"/>
+                <w:szCs w:val="32"/>
+                <w:lang w:val="vi-VN"/>
+              </w:rPr>
+            </m:ctrlPr>
+          </m:sSubPr>
+          <m:e>
+            <m:sSub>
+              <m:sSubPr>
+                <m:ctrlPr>
+                  <w:rPr>
+                    <w:rFonts w:ascii="Cambria Math" w:hAnsi="Cambria Math" w:cs="Times New Roman"/>
+                    <w:iCs/>
+                    <w:sz w:val="32"/>
+                    <w:szCs w:val="32"/>
+                    <w:lang w:val="vi-VN"/>
+                  </w:rPr>
+                </m:ctrlPr>
+              </m:sSubPr>
+              <m:e>
+                <m:r>
+                  <w:rPr>
+                    <w:rFonts w:ascii="Cambria Math" w:hAnsi="Cambria Math" w:cs="Times New Roman"/>
+                    <w:sz w:val="32"/>
+                    <w:szCs w:val="32"/>
+                    <w:lang w:val="vi-VN"/>
+                  </w:rPr>
+                  <m:t>F</m:t>
+                </m:r>
+              </m:e>
+              <m:sub>
+                <m:r>
+                  <w:rPr>
+                    <w:rFonts w:ascii="Cambria Math" w:hAnsi="Cambria Math" w:cs="Times New Roman"/>
+                    <w:sz w:val="32"/>
+                    <w:szCs w:val="32"/>
+                    <w:lang w:val="vi-VN"/>
+                  </w:rPr>
+                  <m:t>G</m:t>
+                </m:r>
+              </m:sub>
+            </m:sSub>
+            <m:r>
+              <w:rPr>
+                <w:rFonts w:ascii="Cambria Math" w:hAnsi="Cambria Math" w:cs="Times New Roman"/>
+                <w:sz w:val="32"/>
+                <w:szCs w:val="32"/>
+                <w:lang w:val="vi-VN"/>
+              </w:rPr>
+              <m:t>,</m:t>
+            </m:r>
+            <m:r>
+              <w:rPr>
+                <w:rFonts w:ascii="Cambria Math" w:hAnsi="Cambria Math" w:cs="Times New Roman"/>
+                <w:sz w:val="32"/>
+                <w:szCs w:val="32"/>
+                <w:lang w:val="vi-VN"/>
+              </w:rPr>
+              <m:t>F</m:t>
+            </m:r>
+          </m:e>
+          <m:sub>
+            <m:r>
+              <w:rPr>
+                <w:rFonts w:ascii="Cambria Math" w:hAnsi="Cambria Math" w:cs="Times New Roman"/>
+                <w:sz w:val="32"/>
+                <w:szCs w:val="32"/>
+                <w:lang w:val="vi-VN"/>
+              </w:rPr>
+              <m:t>B</m:t>
+            </m:r>
+          </m:sub>
+        </m:sSub>
+      </m:oMath>
+      <w:r>
+        <w:rPr>
+          <w:rFonts w:ascii="Times New Roman" w:eastAsiaTheme="minorEastAsia" w:hAnsi="Times New Roman" w:cs="Times New Roman"/>
+          <w:iCs/>
+          <w:sz w:val="32"/>
+          <w:szCs w:val="32"/>
+          <w:lang w:val="vi-VN"/>
+        </w:rPr>
+        <w:t xml:space="preserve"> là hệ số bù trừ độ </w:t>
+      </w:r>
+      <w:r>
+        <w:rPr>
+          <w:rFonts w:ascii="Times New Roman" w:eastAsiaTheme="minorEastAsia" w:hAnsi="Times New Roman" w:cs="Times New Roman"/>
+          <w:iCs/>
+          <w:sz w:val="32"/>
+          <w:szCs w:val="32"/>
+          <w:lang w:val="vi-VN"/>
+        </w:rPr>
+        <w:t>lệch của các kênh tương ứng</w:t>
+      </w:r>
+      <w:r>
+        <w:rPr>
+          <w:rFonts w:ascii="Times New Roman" w:eastAsiaTheme="minorEastAsia" w:hAnsi="Times New Roman" w:cs="Times New Roman"/>
+          <w:iCs/>
+          <w:sz w:val="32"/>
+          <w:szCs w:val="32"/>
+          <w:lang w:val="vi-VN"/>
+        </w:rPr>
+        <w:t xml:space="preserve"> tùy theo chuẩn ảnh ( đối với phim </w:t>
+      </w:r>
+      <w:r>
+        <w:rPr>
+          <w:rFonts w:ascii="Times New Roman" w:hAnsi="Times New Roman" w:cs="Times New Roman"/>
+          <w:sz w:val="32"/>
+          <w:szCs w:val="32"/>
+          <w:lang w:val="vi-VN"/>
+        </w:rPr>
+        <w:t>Orth</w:t>
+      </w:r>
+      <w:r>
+        <w:rPr>
+          <w:rFonts w:ascii="Times New Roman" w:hAnsi="Times New Roman" w:cs="Times New Roman"/>
+          <w:sz w:val="32"/>
+          <w:szCs w:val="32"/>
+          <w:lang w:val="vi-VN"/>
+        </w:rPr>
+        <w:t xml:space="preserve">ochromatic thì </w:t>
+      </w:r>
+      <m:oMath>
+        <m:sSub>
+          <m:sSubPr>
+            <m:ctrlPr>
+              <w:rPr>
+                <w:rFonts w:ascii="Cambria Math" w:hAnsi="Cambria Math" w:cs="Times New Roman"/>
+                <w:iCs/>
+                <w:sz w:val="32"/>
+                <w:szCs w:val="32"/>
+                <w:lang w:val="vi-VN"/>
+              </w:rPr>
+            </m:ctrlPr>
+          </m:sSubPr>
+          <m:e>
+            <m:r>
+              <w:rPr>
+                <w:rFonts w:ascii="Cambria Math" w:hAnsi="Cambria Math" w:cs="Times New Roman"/>
+                <w:sz w:val="32"/>
+                <w:szCs w:val="32"/>
+                <w:lang w:val="vi-VN"/>
+              </w:rPr>
+              <m:t>F</m:t>
+            </m:r>
+          </m:e>
+          <m:sub>
+            <m:r>
+              <w:rPr>
+                <w:rFonts w:ascii="Cambria Math" w:hAnsi="Cambria Math" w:cs="Times New Roman"/>
+                <w:sz w:val="32"/>
+                <w:szCs w:val="32"/>
+                <w:lang w:val="vi-VN"/>
+              </w:rPr>
+              <m:t>R</m:t>
+            </m:r>
+          </m:sub>
+        </m:sSub>
+        <m:r>
+          <w:rPr>
+            <w:rFonts w:ascii="Cambria Math" w:hAnsi="Cambria Math" w:cs="Times New Roman"/>
+            <w:sz w:val="32"/>
+            <w:szCs w:val="32"/>
+            <w:lang w:val="vi-VN"/>
+          </w:rPr>
+          <m:t xml:space="preserve">= </m:t>
+        </m:r>
+        <m:sSub>
+          <m:sSubPr>
+            <m:ctrlPr>
+              <w:rPr>
+                <w:rFonts w:ascii="Cambria Math" w:hAnsi="Cambria Math" w:cs="Times New Roman"/>
+                <w:iCs/>
+                <w:sz w:val="32"/>
+                <w:szCs w:val="32"/>
+                <w:lang w:val="vi-VN"/>
+              </w:rPr>
+            </m:ctrlPr>
+          </m:sSubPr>
+          <m:e>
+            <m:r>
+              <w:rPr>
+                <w:rFonts w:ascii="Cambria Math" w:hAnsi="Cambria Math" w:cs="Times New Roman"/>
+                <w:sz w:val="32"/>
+                <w:szCs w:val="32"/>
+                <w:lang w:val="vi-VN"/>
+              </w:rPr>
+              <m:t>F</m:t>
+            </m:r>
+          </m:e>
+          <m:sub>
+            <m:r>
+              <w:rPr>
+                <w:rFonts w:ascii="Cambria Math" w:hAnsi="Cambria Math" w:cs="Times New Roman"/>
+                <w:sz w:val="32"/>
+                <w:szCs w:val="32"/>
+                <w:lang w:val="vi-VN"/>
+              </w:rPr>
+              <m:t>G</m:t>
+            </m:r>
+          </m:sub>
+        </m:sSub>
+        <m:r>
+          <w:rPr>
+            <w:rFonts w:ascii="Cambria Math" w:hAnsi="Cambria Math" w:cs="Times New Roman"/>
+            <w:sz w:val="32"/>
+            <w:szCs w:val="32"/>
+            <w:lang w:val="vi-VN"/>
+          </w:rPr>
+          <m:t>=</m:t>
+        </m:r>
+        <m:sSub>
+          <m:sSubPr>
+            <m:ctrlPr>
+              <w:rPr>
+                <w:rFonts w:ascii="Cambria Math" w:hAnsi="Cambria Math" w:cs="Times New Roman"/>
+                <w:iCs/>
+                <w:sz w:val="32"/>
+                <w:szCs w:val="32"/>
+                <w:lang w:val="vi-VN"/>
+              </w:rPr>
+            </m:ctrlPr>
+          </m:sSubPr>
+          <m:e>
+            <m:r>
+              <w:rPr>
+                <w:rFonts w:ascii="Cambria Math" w:hAnsi="Cambria Math" w:cs="Times New Roman"/>
+                <w:sz w:val="32"/>
+                <w:szCs w:val="32"/>
+                <w:lang w:val="vi-VN"/>
+              </w:rPr>
+              <m:t>F</m:t>
+            </m:r>
+          </m:e>
+          <m:sub>
+            <m:r>
+              <w:rPr>
+                <w:rFonts w:ascii="Cambria Math" w:hAnsi="Cambria Math" w:cs="Times New Roman"/>
+                <w:sz w:val="32"/>
+                <w:szCs w:val="32"/>
+                <w:lang w:val="vi-VN"/>
+              </w:rPr>
+              <m:t>B</m:t>
+            </m:r>
+          </m:sub>
+        </m:sSub>
+        <m:r>
+          <w:rPr>
+            <w:rFonts w:ascii="Cambria Math" w:hAnsi="Cambria Math" w:cs="Times New Roman"/>
+            <w:sz w:val="32"/>
+            <w:szCs w:val="32"/>
+            <w:lang w:val="vi-VN"/>
+          </w:rPr>
+          <m:t>=1</m:t>
+        </m:r>
+      </m:oMath>
+      <w:r>
+        <w:rPr>
+          <w:rFonts w:ascii="Times New Roman" w:hAnsi="Times New Roman" w:cs="Times New Roman"/>
+          <w:sz w:val="32"/>
+          <w:szCs w:val="32"/>
+          <w:lang w:val="vi-VN"/>
+        </w:rPr>
+        <w:t>)</w:t>
+      </w:r>
+    </w:p>
+    <w:p>
+      <w:pPr>
+        <w:rPr>
+          <w:rFonts w:ascii="Times New Roman" w:eastAsiaTheme="minorEastAsia" w:hAnsi="Times New Roman" w:cs="Times New Roman"/>
+          <w:iCs/>
+          <w:sz w:val="32"/>
+          <w:szCs w:val="32"/>
+          <w:lang w:val="vi-VN"/>
+        </w:rPr>
+      </w:pPr>
+      <w:r>
+        <w:rPr>
+          <w:rFonts w:ascii="Times New Roman" w:eastAsiaTheme="minorEastAsia" w:hAnsi="Times New Roman" w:cs="Times New Roman"/>
+          <w:iCs/>
+          <w:sz w:val="32"/>
+          <w:szCs w:val="32"/>
+          <w:lang w:val="vi-VN"/>
+        </w:rPr>
+        <w:t>L là kênh màu chung sau khi sửa</w:t>
+      </w:r>
+    </w:p>
+    <w:p>
+      <w:pPr>
+        <w:rPr>
+          <w:rFonts w:ascii="Times New Roman" w:hAnsi="Times New Roman" w:cs="Times New Roman"/>
+          <w:sz w:val="32"/>
+          <w:szCs w:val="32"/>
+          <w:u w:val="single"/>
+          <w:lang w:val="vi-VN"/>
+        </w:rPr>
+      </w:pPr>
+      <w:r>
+        <w:rPr>
+          <w:rFonts w:ascii="Times New Roman" w:eastAsiaTheme="minorEastAsia" w:hAnsi="Times New Roman" w:cs="Times New Roman"/>
+          <w:iCs/>
+          <w:sz w:val="32"/>
+          <w:szCs w:val="32"/>
+          <w:lang w:val="vi-VN"/>
+        </w:rPr>
+        <w:t xml:space="preserve">Sau đó ta thu </w:t>
+      </w:r>
+      <w:r>
+        <w:rPr>
+          <w:rFonts w:ascii="Times New Roman" w:eastAsiaTheme="minorEastAsia" w:hAnsi="Times New Roman" w:cs="Times New Roman"/>
+          <w:iCs/>
+          <w:sz w:val="32"/>
+          <w:szCs w:val="32"/>
+          <w:lang w:val="vi-VN"/>
+        </w:rPr>
+        <w:t xml:space="preserve">được màu mới là </w:t>
+      </w:r>
+      <w:r>
+        <w:rPr>
+          <w:rFonts w:ascii="Times New Roman" w:eastAsiaTheme="minorEastAsia" w:hAnsi="Times New Roman" w:cs="Times New Roman"/>
+          <w:iCs/>
+          <w:sz w:val="32"/>
+          <w:szCs w:val="32"/>
+          <w:lang w:val="vi-VN"/>
+        </w:rPr>
+        <w:t>(L,L,L)</w:t>
+      </w:r>
+      <w:r>
+        <w:rPr>
+          <w:rFonts w:ascii="Times New Roman" w:eastAsiaTheme="minorEastAsia" w:hAnsi="Times New Roman" w:cs="Times New Roman"/>
+          <w:iCs/>
+          <w:sz w:val="32"/>
+          <w:szCs w:val="32"/>
+          <w:lang w:val="vi-VN"/>
+        </w:rPr>
+        <w:t>, với 3 kênh màu bằng nhau và bằng với L.</w:t>
+      </w:r>
+    </w:p>
+    <w:p>
+      <w:pPr>
         <w:jc w:val="center"/>
         <w:rPr>
           <w:rFonts w:ascii="Times New Roman" w:hAnsi="Times New Roman" w:cs="Times New Roman"/>
@@ -1745,6 +3018,7 @@
           <w:szCs w:val="44"/>
           <w:lang w:val="vi-VN"/>
         </w:rPr>
+        <w:lastRenderedPageBreak/>
         <w:t xml:space="preserve">Chương </w:t>
       </w:r>
       <w:r>

</xml_diff>

<commit_message>
Thêm giao diện chọn chuẩn ảnh
Thêm font mới
</commit_message>
<xml_diff>
--- a/doc/photo_black.docx
+++ b/doc/photo_black.docx
@@ -1915,19 +1915,7 @@
               <w:szCs w:val="32"/>
               <w:lang w:val="vi-VN"/>
             </w:rPr>
-            <m:t>L=</m:t>
-          </m:r>
-          <m:r>
-            <m:rPr>
-              <m:sty m:val="p"/>
-            </m:rPr>
-            <w:rPr>
-              <w:rFonts w:ascii="Cambria Math" w:hAnsi="Cambria Math" w:cs="Times New Roman"/>
-              <w:sz w:val="32"/>
-              <w:szCs w:val="32"/>
-              <w:lang w:val="vi-VN"/>
-            </w:rPr>
-            <m:t>min(</m:t>
+            <m:t>L=min(</m:t>
           </m:r>
           <m:d>
             <m:dPr>
@@ -2534,16 +2522,7 @@
                 <w:szCs w:val="32"/>
                 <w:lang w:val="vi-VN"/>
               </w:rPr>
-              <m:t>,</m:t>
-            </m:r>
-            <m:r>
-              <w:rPr>
-                <w:rFonts w:ascii="Cambria Math" w:hAnsi="Cambria Math" w:cs="Times New Roman"/>
-                <w:sz w:val="32"/>
-                <w:szCs w:val="32"/>
-                <w:lang w:val="vi-VN"/>
-              </w:rPr>
-              <m:t>F</m:t>
+              <m:t>,F</m:t>
             </m:r>
           </m:e>
           <m:sub>

</xml_diff>

<commit_message>
Thêm tính năng zoom ảnh
</commit_message>
<xml_diff>
--- a/doc/photo_black.docx
+++ b/doc/photo_black.docx
@@ -19,7 +19,7 @@
           <w:szCs w:val="96"/>
           <w:lang w:val="vi-VN"/>
         </w:rPr>
-        <w:t xml:space="preserve">CÁC THUẬT TOÁN </w:t>
+        <w:t xml:space="preserve">CÁC THUẬT </w:t>
       </w:r>
       <w:r>
         <w:rPr>
@@ -28,6 +28,24 @@
           <w:szCs w:val="96"/>
           <w:lang w:val="vi-VN"/>
         </w:rPr>
+        <w:t>TOÁN VÀ KĨ THUẬT</w:t>
+      </w:r>
+      <w:r>
+        <w:rPr>
+          <w:rFonts w:ascii="Times New Roman" w:hAnsi="Times New Roman" w:cs="Times New Roman"/>
+          <w:sz w:val="96"/>
+          <w:szCs w:val="96"/>
+          <w:lang w:val="vi-VN"/>
+        </w:rPr>
+        <w:t xml:space="preserve"> </w:t>
+      </w:r>
+      <w:r>
+        <w:rPr>
+          <w:rFonts w:ascii="Times New Roman" w:hAnsi="Times New Roman" w:cs="Times New Roman"/>
+          <w:sz w:val="96"/>
+          <w:szCs w:val="96"/>
+          <w:lang w:val="vi-VN"/>
+        </w:rPr>
         <w:br/>
         <w:t xml:space="preserve">CỦA PHẦN MỀM </w:t>
       </w:r>
@@ -211,7 +229,6 @@
           <w:szCs w:val="44"/>
           <w:lang w:val="vi-VN"/>
         </w:rPr>
-        <w:lastRenderedPageBreak/>
         <w:t xml:space="preserve">Định nghĩa: </w:t>
       </w:r>
     </w:p>
@@ -267,7 +284,43 @@
           <w:szCs w:val="32"/>
           <w:lang w:val="vi-VN"/>
         </w:rPr>
-        <w:t xml:space="preserve"> : R(đỏ), G(lục),</w:t>
+        <w:t xml:space="preserve"> : R(</w:t>
+      </w:r>
+      <w:r>
+        <w:rPr>
+          <w:rFonts w:ascii="Times New Roman" w:hAnsi="Times New Roman" w:cs="Times New Roman"/>
+          <w:sz w:val="32"/>
+          <w:szCs w:val="32"/>
+          <w:lang w:val="vi-VN"/>
+        </w:rPr>
+        <w:t>Đ</w:t>
+      </w:r>
+      <w:r>
+        <w:rPr>
+          <w:rFonts w:ascii="Times New Roman" w:hAnsi="Times New Roman" w:cs="Times New Roman"/>
+          <w:sz w:val="32"/>
+          <w:szCs w:val="32"/>
+          <w:lang w:val="vi-VN"/>
+        </w:rPr>
+        <w:t>ỏ), G(</w:t>
+      </w:r>
+      <w:r>
+        <w:rPr>
+          <w:rFonts w:ascii="Times New Roman" w:hAnsi="Times New Roman" w:cs="Times New Roman"/>
+          <w:sz w:val="32"/>
+          <w:szCs w:val="32"/>
+          <w:lang w:val="vi-VN"/>
+        </w:rPr>
+        <w:t>L</w:t>
+      </w:r>
+      <w:r>
+        <w:rPr>
+          <w:rFonts w:ascii="Times New Roman" w:hAnsi="Times New Roman" w:cs="Times New Roman"/>
+          <w:sz w:val="32"/>
+          <w:szCs w:val="32"/>
+          <w:lang w:val="vi-VN"/>
+        </w:rPr>
+        <w:t>ục),</w:t>
       </w:r>
       <w:r>
         <w:rPr>
@@ -1718,7 +1771,7 @@
           <w:szCs w:val="32"/>
           <w:lang w:val="vi-VN"/>
         </w:rPr>
-        <w:t>I. Ý tưởng</w:t>
+        <w:t xml:space="preserve">I. Ý </w:t>
       </w:r>
       <w:r>
         <w:rPr>
@@ -1729,7 +1782,41 @@
           <w:szCs w:val="32"/>
           <w:lang w:val="vi-VN"/>
         </w:rPr>
+        <w:t>tưởng</w:t>
+      </w:r>
+      <w:r>
+        <w:rPr>
+          <w:rFonts w:ascii="Times New Roman" w:hAnsi="Times New Roman" w:cs="Times New Roman"/>
+          <w:b/>
+          <w:bCs/>
+          <w:sz w:val="32"/>
+          <w:szCs w:val="32"/>
+          <w:lang w:val="vi-VN"/>
+        </w:rPr>
         <w:t xml:space="preserve"> </w:t>
+      </w:r>
+    </w:p>
+    <w:p>
+      <w:pPr>
+        <w:rPr>
+          <w:rFonts w:ascii="Times New Roman" w:hAnsi="Times New Roman" w:cs="Times New Roman"/>
+          <w:b/>
+          <w:bCs/>
+          <w:sz w:val="32"/>
+          <w:szCs w:val="32"/>
+          <w:lang w:val="vi-VN"/>
+        </w:rPr>
+      </w:pPr>
+      <w:r>
+        <w:rPr>
+          <w:rFonts w:ascii="Times New Roman" w:hAnsi="Times New Roman" w:cs="Times New Roman"/>
+          <w:b/>
+          <w:bCs/>
+          <w:sz w:val="32"/>
+          <w:szCs w:val="32"/>
+          <w:lang w:val="vi-VN"/>
+        </w:rPr>
+        <w:t>1. Ý tưởng</w:t>
       </w:r>
     </w:p>
     <w:p>
@@ -1821,6 +1908,1320 @@
           <w:rFonts w:ascii="Times New Roman" w:hAnsi="Times New Roman" w:cs="Times New Roman"/>
           <w:b/>
           <w:bCs/>
+          <w:sz w:val="32"/>
+          <w:szCs w:val="32"/>
+          <w:lang w:val="vi-VN"/>
+        </w:rPr>
+      </w:pPr>
+      <w:r>
+        <w:rPr>
+          <w:rFonts w:ascii="Times New Roman" w:hAnsi="Times New Roman" w:cs="Times New Roman"/>
+          <w:b/>
+          <w:bCs/>
+          <w:sz w:val="32"/>
+          <w:szCs w:val="32"/>
+          <w:lang w:val="vi-VN"/>
+        </w:rPr>
+        <w:t>2.</w:t>
+      </w:r>
+      <w:r>
+        <w:rPr>
+          <w:rFonts w:ascii="Times New Roman" w:hAnsi="Times New Roman" w:cs="Times New Roman"/>
+          <w:b/>
+          <w:bCs/>
+          <w:sz w:val="32"/>
+          <w:szCs w:val="32"/>
+          <w:lang w:val="vi-VN"/>
+        </w:rPr>
+        <w:t xml:space="preserve">Các hệ số </w:t>
+      </w:r>
+      <w:r>
+        <w:rPr>
+          <w:rFonts w:ascii="Times New Roman" w:hAnsi="Times New Roman" w:cs="Times New Roman"/>
+          <w:b/>
+          <w:bCs/>
+          <w:sz w:val="32"/>
+          <w:szCs w:val="32"/>
+          <w:lang w:val="vi-VN"/>
+        </w:rPr>
+        <w:t>bù trừ độ lệch</w:t>
+      </w:r>
+    </w:p>
+    <w:p>
+      <w:pPr>
+        <w:rPr>
+          <w:rFonts w:ascii="Times New Roman" w:hAnsi="Times New Roman" w:cs="Times New Roman"/>
+          <w:sz w:val="32"/>
+          <w:szCs w:val="32"/>
+          <w:lang w:val="vi-VN"/>
+        </w:rPr>
+      </w:pPr>
+      <w:r>
+        <w:rPr>
+          <w:rFonts w:ascii="Times New Roman" w:hAnsi="Times New Roman" w:cs="Times New Roman"/>
+          <w:sz w:val="32"/>
+          <w:szCs w:val="32"/>
+          <w:lang w:val="vi-VN"/>
+        </w:rPr>
+        <w:t xml:space="preserve">Tùy vào mỗi chuẩn ảnh trắng đen mà chúng lại nhạy </w:t>
+      </w:r>
+      <w:r>
+        <w:rPr>
+          <w:rFonts w:ascii="Times New Roman" w:hAnsi="Times New Roman" w:cs="Times New Roman"/>
+          <w:sz w:val="32"/>
+          <w:szCs w:val="32"/>
+          <w:lang w:val="vi-VN"/>
+        </w:rPr>
+        <w:t>hơn/kém nhạy hơn</w:t>
+      </w:r>
+      <w:r>
+        <w:rPr>
+          <w:rFonts w:ascii="Times New Roman" w:hAnsi="Times New Roman" w:cs="Times New Roman"/>
+          <w:sz w:val="32"/>
+          <w:szCs w:val="32"/>
+          <w:lang w:val="vi-VN"/>
+        </w:rPr>
+        <w:t xml:space="preserve"> về một </w:t>
+      </w:r>
+      <w:r>
+        <w:rPr>
+          <w:rFonts w:ascii="Times New Roman" w:hAnsi="Times New Roman" w:cs="Times New Roman"/>
+          <w:sz w:val="32"/>
+          <w:szCs w:val="32"/>
+          <w:lang w:val="vi-VN"/>
+        </w:rPr>
+        <w:t xml:space="preserve">hay nhiều </w:t>
+      </w:r>
+      <w:r>
+        <w:rPr>
+          <w:rFonts w:ascii="Times New Roman" w:hAnsi="Times New Roman" w:cs="Times New Roman"/>
+          <w:sz w:val="32"/>
+          <w:szCs w:val="32"/>
+          <w:lang w:val="vi-VN"/>
+        </w:rPr>
+        <w:t>màu sắc nào đó trong số 3 màu Đỏ, Lục, Lam</w:t>
+      </w:r>
+      <w:r>
+        <w:rPr>
+          <w:rFonts w:ascii="Times New Roman" w:hAnsi="Times New Roman" w:cs="Times New Roman"/>
+          <w:sz w:val="32"/>
+          <w:szCs w:val="32"/>
+          <w:lang w:val="vi-VN"/>
+        </w:rPr>
+        <w:t>.</w:t>
+      </w:r>
+    </w:p>
+    <w:p>
+      <w:pPr>
+        <w:rPr>
+          <w:rFonts w:ascii="Times New Roman" w:hAnsi="Times New Roman" w:cs="Times New Roman"/>
+          <w:sz w:val="32"/>
+          <w:szCs w:val="32"/>
+          <w:lang w:val="vi-VN"/>
+        </w:rPr>
+      </w:pPr>
+      <w:r>
+        <w:rPr>
+          <w:rFonts w:ascii="Times New Roman" w:hAnsi="Times New Roman" w:cs="Times New Roman"/>
+          <w:sz w:val="32"/>
+          <w:szCs w:val="32"/>
+          <w:lang w:val="vi-VN"/>
+        </w:rPr>
+        <w:t xml:space="preserve"> </w:t>
+      </w:r>
+      <w:r>
+        <w:rPr>
+          <w:rFonts w:ascii="Times New Roman" w:hAnsi="Times New Roman" w:cs="Times New Roman"/>
+          <w:sz w:val="32"/>
+          <w:szCs w:val="32"/>
+          <w:lang w:val="vi-VN"/>
+        </w:rPr>
+        <w:t xml:space="preserve">Vì vậy, khi sửa lại các màu ảnh, ta cũng cần quan tâm đến các hệ số bù trừ màu tùy theo chuẩn ảnh </w:t>
+      </w:r>
+      <w:r>
+        <w:rPr>
+          <w:rFonts w:ascii="Times New Roman" w:hAnsi="Times New Roman" w:cs="Times New Roman"/>
+          <w:sz w:val="32"/>
+          <w:szCs w:val="32"/>
+          <w:lang w:val="vi-VN"/>
+        </w:rPr>
+        <w:t>này.</w:t>
+      </w:r>
+    </w:p>
+    <w:p>
+      <w:pPr>
+        <w:rPr>
+          <w:rFonts w:ascii="Times New Roman" w:hAnsi="Times New Roman" w:cs="Times New Roman"/>
+          <w:sz w:val="32"/>
+          <w:szCs w:val="32"/>
+          <w:lang w:val="vi-VN"/>
+        </w:rPr>
+      </w:pPr>
+      <w:r>
+        <w:rPr>
+          <w:rFonts w:ascii="Times New Roman" w:hAnsi="Times New Roman" w:cs="Times New Roman"/>
+          <w:sz w:val="32"/>
+          <w:szCs w:val="32"/>
+          <w:lang w:val="vi-VN"/>
+        </w:rPr>
+        <w:t>Để các công thức sửa chữa hoạt động đúng đắn</w:t>
+      </w:r>
+      <w:r>
+        <w:rPr>
+          <w:rFonts w:ascii="Times New Roman" w:hAnsi="Times New Roman" w:cs="Times New Roman"/>
+          <w:sz w:val="32"/>
+          <w:szCs w:val="32"/>
+          <w:lang w:val="vi-VN"/>
+        </w:rPr>
+        <w:t xml:space="preserve"> (ít lệch màu so với ảnh gốc nhất)</w:t>
+      </w:r>
+      <w:r>
+        <w:rPr>
+          <w:rFonts w:ascii="Times New Roman" w:hAnsi="Times New Roman" w:cs="Times New Roman"/>
+          <w:sz w:val="32"/>
+          <w:szCs w:val="32"/>
+          <w:lang w:val="vi-VN"/>
+        </w:rPr>
+        <w:t>, thì</w:t>
+      </w:r>
+      <w:r>
+        <w:rPr>
+          <w:rFonts w:ascii="Times New Roman" w:hAnsi="Times New Roman" w:cs="Times New Roman"/>
+          <w:sz w:val="32"/>
+          <w:szCs w:val="32"/>
+          <w:lang w:val="vi-VN"/>
+        </w:rPr>
+        <w:t xml:space="preserve"> </w:t>
+      </w:r>
+      <w:r>
+        <w:rPr>
+          <w:rFonts w:ascii="Times New Roman" w:hAnsi="Times New Roman" w:cs="Times New Roman"/>
+          <w:sz w:val="32"/>
+          <w:szCs w:val="32"/>
+          <w:lang w:val="vi-VN"/>
+        </w:rPr>
+        <w:t xml:space="preserve">ta đặt </w:t>
+      </w:r>
+      <w:r>
+        <w:rPr>
+          <w:rFonts w:ascii="Times New Roman" w:hAnsi="Times New Roman" w:cs="Times New Roman"/>
+          <w:sz w:val="32"/>
+          <w:szCs w:val="32"/>
+          <w:lang w:val="vi-VN"/>
+        </w:rPr>
+        <w:t xml:space="preserve">hệ số bù của kênh màu P nhạy nhất </w:t>
+      </w:r>
+      <m:oMath>
+        <m:sSub>
+          <m:sSubPr>
+            <m:ctrlPr>
+              <w:rPr>
+                <w:rFonts w:ascii="Cambria Math" w:hAnsi="Cambria Math" w:cs="Times New Roman"/>
+                <w:iCs/>
+                <w:sz w:val="32"/>
+                <w:szCs w:val="32"/>
+                <w:lang w:val="vi-VN"/>
+              </w:rPr>
+            </m:ctrlPr>
+          </m:sSubPr>
+          <m:e>
+            <m:r>
+              <w:rPr>
+                <w:rFonts w:ascii="Cambria Math" w:hAnsi="Cambria Math" w:cs="Times New Roman"/>
+                <w:sz w:val="32"/>
+                <w:szCs w:val="32"/>
+                <w:lang w:val="vi-VN"/>
+              </w:rPr>
+              <m:t>F</m:t>
+            </m:r>
+          </m:e>
+          <m:sub>
+            <m:r>
+              <w:rPr>
+                <w:rFonts w:ascii="Cambria Math" w:hAnsi="Cambria Math" w:cs="Times New Roman"/>
+                <w:sz w:val="32"/>
+                <w:szCs w:val="32"/>
+                <w:lang w:val="vi-VN"/>
+              </w:rPr>
+              <m:t>P</m:t>
+            </m:r>
+          </m:sub>
+        </m:sSub>
+        <m:r>
+          <w:rPr>
+            <w:rFonts w:ascii="Cambria Math" w:hAnsi="Cambria Math" w:cs="Times New Roman"/>
+            <w:sz w:val="32"/>
+            <w:szCs w:val="32"/>
+            <w:lang w:val="vi-VN"/>
+          </w:rPr>
+          <m:t>=1</m:t>
+        </m:r>
+      </m:oMath>
+      <w:r>
+        <w:rPr>
+          <w:rFonts w:ascii="Times New Roman" w:eastAsiaTheme="minorEastAsia" w:hAnsi="Times New Roman" w:cs="Times New Roman"/>
+          <w:iCs/>
+          <w:sz w:val="32"/>
+          <w:szCs w:val="32"/>
+          <w:lang w:val="vi-VN"/>
+        </w:rPr>
+        <w:t xml:space="preserve"> .</w:t>
+      </w:r>
+    </w:p>
+    <w:p>
+      <w:pPr>
+        <w:rPr>
+          <w:rFonts w:ascii="Times New Roman" w:hAnsi="Times New Roman" w:cs="Times New Roman"/>
+          <w:b/>
+          <w:bCs/>
+          <w:sz w:val="32"/>
+          <w:szCs w:val="32"/>
+          <w:lang w:val="vi-VN"/>
+        </w:rPr>
+      </w:pPr>
+      <w:r>
+        <w:rPr>
+          <w:rFonts w:ascii="Times New Roman" w:hAnsi="Times New Roman" w:cs="Times New Roman"/>
+          <w:b/>
+          <w:bCs/>
+          <w:sz w:val="32"/>
+          <w:szCs w:val="32"/>
+          <w:lang w:val="vi-VN"/>
+        </w:rPr>
+        <w:t>*</w:t>
+      </w:r>
+      <w:r>
+        <w:rPr>
+          <w:rFonts w:ascii="Times New Roman" w:hAnsi="Times New Roman" w:cs="Times New Roman"/>
+          <w:b/>
+          <w:bCs/>
+          <w:sz w:val="32"/>
+          <w:szCs w:val="32"/>
+          <w:lang w:val="vi-VN"/>
+        </w:rPr>
+        <w:t xml:space="preserve"> Hệ số bù trừ của phim </w:t>
+      </w:r>
+      <w:r>
+        <w:rPr>
+          <w:rFonts w:ascii="Times New Roman" w:hAnsi="Times New Roman" w:cs="Times New Roman"/>
+          <w:b/>
+          <w:bCs/>
+          <w:sz w:val="32"/>
+          <w:szCs w:val="32"/>
+          <w:lang w:val="vi-VN"/>
+        </w:rPr>
+        <w:t>Orthochromatic</w:t>
+      </w:r>
+    </w:p>
+    <w:p>
+      <w:pPr>
+        <w:rPr>
+          <w:rFonts w:ascii="Times New Roman" w:eastAsiaTheme="minorEastAsia" w:hAnsi="Times New Roman" w:cs="Times New Roman"/>
+          <w:sz w:val="32"/>
+          <w:szCs w:val="32"/>
+          <w:lang w:val="vi-VN"/>
+        </w:rPr>
+      </w:pPr>
+      <w:r>
+        <w:rPr>
+          <w:rFonts w:ascii="Times New Roman" w:hAnsi="Times New Roman" w:cs="Times New Roman"/>
+          <w:sz w:val="32"/>
+          <w:szCs w:val="32"/>
+          <w:lang w:val="vi-VN"/>
+        </w:rPr>
+        <w:t xml:space="preserve">Phim </w:t>
+      </w:r>
+      <w:r>
+        <w:rPr>
+          <w:rFonts w:ascii="Times New Roman" w:hAnsi="Times New Roman" w:cs="Times New Roman"/>
+          <w:sz w:val="32"/>
+          <w:szCs w:val="32"/>
+          <w:lang w:val="vi-VN"/>
+        </w:rPr>
+        <w:t>Orthochromatic</w:t>
+      </w:r>
+      <w:r>
+        <w:rPr>
+          <w:rFonts w:ascii="Times New Roman" w:hAnsi="Times New Roman" w:cs="Times New Roman"/>
+          <w:sz w:val="32"/>
+          <w:szCs w:val="32"/>
+          <w:lang w:val="vi-VN"/>
+        </w:rPr>
+        <w:t xml:space="preserve"> </w:t>
+      </w:r>
+      <w:r>
+        <w:rPr>
+          <w:rFonts w:ascii="Times New Roman" w:hAnsi="Times New Roman" w:cs="Times New Roman"/>
+          <w:sz w:val="32"/>
+          <w:szCs w:val="32"/>
+          <w:lang w:val="vi-VN"/>
+        </w:rPr>
+        <w:t xml:space="preserve">nhạy nhất với màu Lam. </w:t>
+      </w:r>
+      <w:r>
+        <w:rPr>
+          <w:rFonts w:ascii="Times New Roman" w:hAnsi="Times New Roman" w:cs="Times New Roman"/>
+          <w:sz w:val="32"/>
+          <w:szCs w:val="32"/>
+          <w:lang w:val="vi-VN"/>
+        </w:rPr>
+        <w:t xml:space="preserve">Vì vậy, ta có </w:t>
+      </w:r>
+      <m:oMath>
+        <m:sSub>
+          <m:sSubPr>
+            <m:ctrlPr>
+              <w:rPr>
+                <w:rFonts w:ascii="Cambria Math" w:hAnsi="Cambria Math" w:cs="Times New Roman"/>
+                <w:iCs/>
+                <w:sz w:val="32"/>
+                <w:szCs w:val="32"/>
+                <w:lang w:val="vi-VN"/>
+              </w:rPr>
+            </m:ctrlPr>
+          </m:sSubPr>
+          <m:e>
+            <m:r>
+              <w:rPr>
+                <w:rFonts w:ascii="Cambria Math" w:hAnsi="Cambria Math" w:cs="Times New Roman"/>
+                <w:sz w:val="32"/>
+                <w:szCs w:val="32"/>
+                <w:lang w:val="vi-VN"/>
+              </w:rPr>
+              <m:t>F</m:t>
+            </m:r>
+          </m:e>
+          <m:sub>
+            <m:r>
+              <w:rPr>
+                <w:rFonts w:ascii="Cambria Math" w:hAnsi="Cambria Math" w:cs="Times New Roman"/>
+                <w:sz w:val="32"/>
+                <w:szCs w:val="32"/>
+                <w:lang w:val="vi-VN"/>
+              </w:rPr>
+              <m:t>B</m:t>
+            </m:r>
+          </m:sub>
+        </m:sSub>
+        <m:r>
+          <w:rPr>
+            <w:rFonts w:ascii="Cambria Math" w:hAnsi="Cambria Math" w:cs="Times New Roman"/>
+            <w:sz w:val="32"/>
+            <w:szCs w:val="32"/>
+            <w:lang w:val="vi-VN"/>
+          </w:rPr>
+          <m:t>=1</m:t>
+        </m:r>
+      </m:oMath>
+    </w:p>
+    <w:p>
+      <w:pPr>
+        <w:rPr>
+          <w:rFonts w:ascii="Times New Roman" w:hAnsi="Times New Roman" w:cs="Times New Roman"/>
+          <w:sz w:val="32"/>
+          <w:szCs w:val="32"/>
+          <w:lang w:val="vi-VN"/>
+        </w:rPr>
+      </w:pPr>
+      <w:r>
+        <w:rPr>
+          <w:rFonts w:ascii="Times New Roman" w:hAnsi="Times New Roman" w:cs="Times New Roman"/>
+          <w:sz w:val="32"/>
+          <w:szCs w:val="32"/>
+          <w:lang w:val="vi-VN"/>
+        </w:rPr>
+        <w:t>Theo lý thuyết, loại phim này mù màu đỏ, tuy nhiên</w:t>
+      </w:r>
+      <w:r>
+        <w:rPr>
+          <w:rFonts w:ascii="Times New Roman" w:hAnsi="Times New Roman" w:cs="Times New Roman"/>
+          <w:sz w:val="32"/>
+          <w:szCs w:val="32"/>
+          <w:lang w:val="vi-VN"/>
+        </w:rPr>
+        <w:t xml:space="preserve"> trên thực tế, giá trị R trên các điểm ảnh loại phim này ở các vật thể mang màu đỏ hiếm khi về 0 hoàn toàn.</w:t>
+      </w:r>
+      <w:r>
+        <w:rPr>
+          <w:rFonts w:ascii="Times New Roman" w:hAnsi="Times New Roman" w:cs="Times New Roman"/>
+          <w:sz w:val="32"/>
+          <w:szCs w:val="32"/>
+          <w:lang w:val="vi-VN"/>
+        </w:rPr>
+        <w:t xml:space="preserve"> </w:t>
+      </w:r>
+    </w:p>
+    <w:p>
+      <w:pPr>
+        <w:rPr>
+          <w:rFonts w:ascii="Times New Roman" w:eastAsiaTheme="minorEastAsia" w:hAnsi="Times New Roman" w:cs="Times New Roman"/>
+          <w:iCs/>
+          <w:sz w:val="32"/>
+          <w:szCs w:val="32"/>
+          <w:lang w:val="vi-VN"/>
+        </w:rPr>
+      </w:pPr>
+      <w:r>
+        <w:rPr>
+          <w:rFonts w:ascii="Times New Roman" w:hAnsi="Times New Roman" w:cs="Times New Roman"/>
+          <w:sz w:val="32"/>
+          <w:szCs w:val="32"/>
+          <w:lang w:val="vi-VN"/>
+        </w:rPr>
+        <w:t>Đ</w:t>
+      </w:r>
+      <w:r>
+        <w:rPr>
+          <w:rFonts w:ascii="Times New Roman" w:hAnsi="Times New Roman" w:cs="Times New Roman"/>
+          <w:sz w:val="32"/>
+          <w:szCs w:val="32"/>
+          <w:lang w:val="vi-VN"/>
+        </w:rPr>
+        <w:t xml:space="preserve">ể tránh gây ra nhiều lỗi hơn cho các thuật toán ở sau này, ta đặt ở ngưỡng chấp nhận được </w:t>
+      </w:r>
+      <m:oMath>
+        <m:sSub>
+          <m:sSubPr>
+            <m:ctrlPr>
+              <w:rPr>
+                <w:rFonts w:ascii="Cambria Math" w:hAnsi="Cambria Math" w:cs="Times New Roman"/>
+                <w:iCs/>
+                <w:sz w:val="32"/>
+                <w:szCs w:val="32"/>
+                <w:lang w:val="vi-VN"/>
+              </w:rPr>
+            </m:ctrlPr>
+          </m:sSubPr>
+          <m:e>
+            <m:r>
+              <w:rPr>
+                <w:rFonts w:ascii="Cambria Math" w:hAnsi="Cambria Math" w:cs="Times New Roman"/>
+                <w:sz w:val="32"/>
+                <w:szCs w:val="32"/>
+                <w:lang w:val="vi-VN"/>
+              </w:rPr>
+              <m:t>F</m:t>
+            </m:r>
+          </m:e>
+          <m:sub>
+            <m:r>
+              <w:rPr>
+                <w:rFonts w:ascii="Cambria Math" w:hAnsi="Cambria Math" w:cs="Times New Roman"/>
+                <w:sz w:val="32"/>
+                <w:szCs w:val="32"/>
+                <w:lang w:val="vi-VN"/>
+              </w:rPr>
+              <m:t>R</m:t>
+            </m:r>
+          </m:sub>
+        </m:sSub>
+        <m:r>
+          <w:rPr>
+            <w:rFonts w:ascii="Cambria Math" w:hAnsi="Cambria Math" w:cs="Times New Roman"/>
+            <w:sz w:val="32"/>
+            <w:szCs w:val="32"/>
+            <w:lang w:val="vi-VN"/>
+          </w:rPr>
+          <m:t>= 0.15</m:t>
+        </m:r>
+      </m:oMath>
+      <w:r>
+        <w:rPr>
+          <w:rFonts w:ascii="Times New Roman" w:eastAsiaTheme="minorEastAsia" w:hAnsi="Times New Roman" w:cs="Times New Roman"/>
+          <w:iCs/>
+          <w:sz w:val="32"/>
+          <w:szCs w:val="32"/>
+          <w:lang w:val="vi-VN"/>
+        </w:rPr>
+        <w:t xml:space="preserve"> .</w:t>
+      </w:r>
+    </w:p>
+    <w:p>
+      <w:pPr>
+        <w:rPr>
+          <w:rFonts w:ascii="Times New Roman" w:eastAsiaTheme="minorEastAsia" w:hAnsi="Times New Roman" w:cs="Times New Roman"/>
+          <w:sz w:val="32"/>
+          <w:szCs w:val="32"/>
+          <w:lang w:val="vi-VN"/>
+        </w:rPr>
+      </w:pPr>
+      <w:r>
+        <w:rPr>
+          <w:rFonts w:ascii="Times New Roman" w:eastAsiaTheme="minorEastAsia" w:hAnsi="Times New Roman" w:cs="Times New Roman"/>
+          <w:iCs/>
+          <w:sz w:val="32"/>
+          <w:szCs w:val="32"/>
+          <w:lang w:val="vi-VN"/>
+        </w:rPr>
+        <w:t>Loại phim này nhạy ở mức trung bình với màu Lục, trên thực tế, ta có thể thấy nó hoàn toàn không nhạy bằng màu Lam</w:t>
+      </w:r>
+      <w:r>
+        <w:rPr>
+          <w:rFonts w:ascii="Times New Roman" w:eastAsiaTheme="minorEastAsia" w:hAnsi="Times New Roman" w:cs="Times New Roman"/>
+          <w:iCs/>
+          <w:sz w:val="32"/>
+          <w:szCs w:val="32"/>
+          <w:lang w:val="vi-VN"/>
+        </w:rPr>
+        <w:t xml:space="preserve"> nhưng thường nhạy hơn nhiều so với Đỏ. </w:t>
+      </w:r>
+      <w:r>
+        <w:rPr>
+          <w:rFonts w:ascii="Times New Roman" w:eastAsiaTheme="minorEastAsia" w:hAnsi="Times New Roman" w:cs="Times New Roman"/>
+          <w:iCs/>
+          <w:sz w:val="32"/>
+          <w:szCs w:val="32"/>
+          <w:lang w:val="vi-VN"/>
+        </w:rPr>
+        <w:t xml:space="preserve">Vì lí do đó, ta tạm đặt </w:t>
+      </w:r>
+      <m:oMath>
+        <m:sSub>
+          <m:sSubPr>
+            <m:ctrlPr>
+              <w:rPr>
+                <w:rFonts w:ascii="Cambria Math" w:hAnsi="Cambria Math" w:cs="Times New Roman"/>
+                <w:iCs/>
+                <w:sz w:val="32"/>
+                <w:szCs w:val="32"/>
+                <w:lang w:val="vi-VN"/>
+              </w:rPr>
+            </m:ctrlPr>
+          </m:sSubPr>
+          <m:e>
+            <m:r>
+              <w:rPr>
+                <w:rFonts w:ascii="Cambria Math" w:hAnsi="Cambria Math" w:cs="Times New Roman"/>
+                <w:sz w:val="32"/>
+                <w:szCs w:val="32"/>
+                <w:lang w:val="vi-VN"/>
+              </w:rPr>
+              <m:t>F</m:t>
+            </m:r>
+          </m:e>
+          <m:sub>
+            <m:r>
+              <w:rPr>
+                <w:rFonts w:ascii="Cambria Math" w:hAnsi="Cambria Math" w:cs="Times New Roman"/>
+                <w:sz w:val="32"/>
+                <w:szCs w:val="32"/>
+                <w:lang w:val="vi-VN"/>
+              </w:rPr>
+              <m:t>G</m:t>
+            </m:r>
+          </m:sub>
+        </m:sSub>
+        <m:r>
+          <w:rPr>
+            <w:rFonts w:ascii="Cambria Math" w:hAnsi="Cambria Math" w:cs="Times New Roman"/>
+            <w:sz w:val="32"/>
+            <w:szCs w:val="32"/>
+            <w:lang w:val="vi-VN"/>
+          </w:rPr>
+          <m:t>= 0.5</m:t>
+        </m:r>
+      </m:oMath>
+    </w:p>
+    <w:p>
+      <w:pPr>
+        <w:rPr>
+          <w:rFonts w:ascii="Times New Roman" w:hAnsi="Times New Roman" w:cs="Times New Roman"/>
+          <w:b/>
+          <w:bCs/>
+          <w:sz w:val="32"/>
+          <w:szCs w:val="32"/>
+          <w:lang w:val="vi-VN"/>
+        </w:rPr>
+      </w:pPr>
+      <w:r>
+        <w:rPr>
+          <w:rFonts w:ascii="Times New Roman" w:hAnsi="Times New Roman" w:cs="Times New Roman"/>
+          <w:b/>
+          <w:bCs/>
+          <w:sz w:val="32"/>
+          <w:szCs w:val="32"/>
+          <w:lang w:val="vi-VN"/>
+        </w:rPr>
+        <w:t xml:space="preserve">* Hệ số bù trừ của </w:t>
+      </w:r>
+      <w:r>
+        <w:rPr>
+          <w:rFonts w:ascii="Times New Roman" w:hAnsi="Times New Roman" w:cs="Times New Roman"/>
+          <w:b/>
+          <w:bCs/>
+          <w:sz w:val="32"/>
+          <w:szCs w:val="32"/>
+          <w:lang w:val="vi-VN"/>
+        </w:rPr>
+        <w:t>chuẩn Rec. 601</w:t>
+      </w:r>
+    </w:p>
+    <w:p>
+      <w:pPr>
+        <w:rPr>
+          <w:rFonts w:ascii="Times New Roman" w:hAnsi="Times New Roman" w:cs="Times New Roman"/>
+          <w:sz w:val="32"/>
+          <w:szCs w:val="32"/>
+          <w:lang w:val="vi-VN"/>
+        </w:rPr>
+      </w:pPr>
+      <w:r>
+        <w:rPr>
+          <w:rFonts w:ascii="Times New Roman" w:hAnsi="Times New Roman" w:cs="Times New Roman"/>
+          <w:sz w:val="32"/>
+          <w:szCs w:val="32"/>
+          <w:lang w:val="vi-VN"/>
+        </w:rPr>
+        <w:t xml:space="preserve">Vì là tiêu chuẩn kĩ thuật </w:t>
+      </w:r>
+      <w:r>
+        <w:rPr>
+          <w:rFonts w:ascii="Times New Roman" w:hAnsi="Times New Roman" w:cs="Times New Roman"/>
+          <w:sz w:val="32"/>
+          <w:szCs w:val="32"/>
+          <w:lang w:val="vi-VN"/>
+        </w:rPr>
+        <w:t>có cơ sở rõ ràng, nên ta sẽ sử dụng theo chuẩn đã được nghiên cứu</w:t>
+      </w:r>
+      <w:r>
+        <w:rPr>
+          <w:rFonts w:ascii="Times New Roman" w:hAnsi="Times New Roman" w:cs="Times New Roman"/>
+          <w:sz w:val="32"/>
+          <w:szCs w:val="32"/>
+          <w:lang w:val="vi-VN"/>
+        </w:rPr>
+        <w:t xml:space="preserve"> là </w:t>
+      </w:r>
+      <m:oMath>
+        <m:sSub>
+          <m:sSubPr>
+            <m:ctrlPr>
+              <w:rPr>
+                <w:rFonts w:ascii="Cambria Math" w:hAnsi="Cambria Math" w:cs="Times New Roman"/>
+                <w:iCs/>
+                <w:sz w:val="32"/>
+                <w:szCs w:val="32"/>
+                <w:lang w:val="vi-VN"/>
+              </w:rPr>
+            </m:ctrlPr>
+          </m:sSubPr>
+          <m:e>
+            <m:r>
+              <w:rPr>
+                <w:rFonts w:ascii="Cambria Math" w:hAnsi="Cambria Math" w:cs="Times New Roman"/>
+                <w:sz w:val="32"/>
+                <w:szCs w:val="32"/>
+                <w:lang w:val="vi-VN"/>
+              </w:rPr>
+              <m:t>F</m:t>
+            </m:r>
+          </m:e>
+          <m:sub>
+            <m:r>
+              <w:rPr>
+                <w:rFonts w:ascii="Cambria Math" w:hAnsi="Cambria Math" w:cs="Times New Roman"/>
+                <w:sz w:val="32"/>
+                <w:szCs w:val="32"/>
+                <w:lang w:val="vi-VN"/>
+              </w:rPr>
+              <m:t>R</m:t>
+            </m:r>
+          </m:sub>
+        </m:sSub>
+        <m:r>
+          <w:rPr>
+            <w:rFonts w:ascii="Cambria Math" w:hAnsi="Cambria Math" w:cs="Times New Roman"/>
+            <w:sz w:val="32"/>
+            <w:szCs w:val="32"/>
+            <w:lang w:val="vi-VN"/>
+          </w:rPr>
+          <m:t>≈ 0.509;</m:t>
+        </m:r>
+        <m:sSub>
+          <m:sSubPr>
+            <m:ctrlPr>
+              <w:rPr>
+                <w:rFonts w:ascii="Cambria Math" w:hAnsi="Cambria Math" w:cs="Times New Roman"/>
+                <w:iCs/>
+                <w:sz w:val="32"/>
+                <w:szCs w:val="32"/>
+                <w:lang w:val="vi-VN"/>
+              </w:rPr>
+            </m:ctrlPr>
+          </m:sSubPr>
+          <m:e>
+            <m:r>
+              <w:rPr>
+                <w:rFonts w:ascii="Cambria Math" w:hAnsi="Cambria Math" w:cs="Times New Roman"/>
+                <w:sz w:val="32"/>
+                <w:szCs w:val="32"/>
+                <w:lang w:val="vi-VN"/>
+              </w:rPr>
+              <m:t>F</m:t>
+            </m:r>
+          </m:e>
+          <m:sub>
+            <m:r>
+              <w:rPr>
+                <w:rFonts w:ascii="Cambria Math" w:hAnsi="Cambria Math" w:cs="Times New Roman"/>
+                <w:sz w:val="32"/>
+                <w:szCs w:val="32"/>
+                <w:lang w:val="vi-VN"/>
+              </w:rPr>
+              <m:t>G</m:t>
+            </m:r>
+          </m:sub>
+        </m:sSub>
+        <m:r>
+          <w:rPr>
+            <w:rFonts w:ascii="Cambria Math" w:hAnsi="Cambria Math" w:cs="Times New Roman"/>
+            <w:sz w:val="32"/>
+            <w:szCs w:val="32"/>
+            <w:lang w:val="vi-VN"/>
+          </w:rPr>
+          <m:t>= 1;</m:t>
+        </m:r>
+        <m:sSub>
+          <m:sSubPr>
+            <m:ctrlPr>
+              <w:rPr>
+                <w:rFonts w:ascii="Cambria Math" w:hAnsi="Cambria Math" w:cs="Times New Roman"/>
+                <w:iCs/>
+                <w:sz w:val="32"/>
+                <w:szCs w:val="32"/>
+                <w:lang w:val="vi-VN"/>
+              </w:rPr>
+            </m:ctrlPr>
+          </m:sSubPr>
+          <m:e>
+            <m:r>
+              <w:rPr>
+                <w:rFonts w:ascii="Cambria Math" w:hAnsi="Cambria Math" w:cs="Times New Roman"/>
+                <w:sz w:val="32"/>
+                <w:szCs w:val="32"/>
+                <w:lang w:val="vi-VN"/>
+              </w:rPr>
+              <m:t>F</m:t>
+            </m:r>
+          </m:e>
+          <m:sub>
+            <m:r>
+              <w:rPr>
+                <w:rFonts w:ascii="Cambria Math" w:hAnsi="Cambria Math" w:cs="Times New Roman"/>
+                <w:sz w:val="32"/>
+                <w:szCs w:val="32"/>
+                <w:lang w:val="vi-VN"/>
+              </w:rPr>
+              <m:t>B</m:t>
+            </m:r>
+          </m:sub>
+        </m:sSub>
+        <m:r>
+          <w:rPr>
+            <w:rFonts w:ascii="Cambria Math" w:hAnsi="Cambria Math" w:cs="Times New Roman"/>
+            <w:sz w:val="32"/>
+            <w:szCs w:val="32"/>
+            <w:lang w:val="vi-VN"/>
+          </w:rPr>
+          <m:t>= 0.194</m:t>
+        </m:r>
+      </m:oMath>
+      <w:r>
+        <w:rPr>
+          <w:rFonts w:ascii="Times New Roman" w:eastAsiaTheme="minorEastAsia" w:hAnsi="Times New Roman" w:cs="Times New Roman"/>
+          <w:iCs/>
+          <w:sz w:val="32"/>
+          <w:szCs w:val="32"/>
+          <w:lang w:val="vi-VN"/>
+        </w:rPr>
+        <w:t xml:space="preserve"> </w:t>
+      </w:r>
+      <w:r>
+        <w:rPr>
+          <w:rFonts w:ascii="Times New Roman" w:eastAsiaTheme="minorEastAsia" w:hAnsi="Times New Roman" w:cs="Times New Roman"/>
+          <w:iCs/>
+          <w:sz w:val="32"/>
+          <w:szCs w:val="32"/>
+          <w:lang w:val="vi-VN"/>
+        </w:rPr>
+        <w:t xml:space="preserve"> </w:t>
+      </w:r>
+      <w:r>
+        <w:rPr>
+          <w:rFonts w:ascii="Times New Roman" w:eastAsiaTheme="minorEastAsia" w:hAnsi="Times New Roman" w:cs="Times New Roman"/>
+          <w:iCs/>
+          <w:sz w:val="32"/>
+          <w:szCs w:val="32"/>
+          <w:lang w:val="vi-VN"/>
+        </w:rPr>
+        <w:t xml:space="preserve">( Lưu ý, về </w:t>
+      </w:r>
+      <w:r>
+        <w:rPr>
+          <w:rFonts w:ascii="Times New Roman" w:eastAsiaTheme="minorEastAsia" w:hAnsi="Times New Roman" w:cs="Times New Roman"/>
+          <w:iCs/>
+          <w:sz w:val="32"/>
+          <w:szCs w:val="32"/>
+          <w:lang w:val="vi-VN"/>
+        </w:rPr>
+        <w:lastRenderedPageBreak/>
+        <w:t xml:space="preserve">bản chất, </w:t>
+      </w:r>
+      <m:oMath>
+        <m:sSub>
+          <m:sSubPr>
+            <m:ctrlPr>
+              <w:rPr>
+                <w:rFonts w:ascii="Cambria Math" w:hAnsi="Cambria Math" w:cs="Times New Roman"/>
+                <w:iCs/>
+                <w:sz w:val="32"/>
+                <w:szCs w:val="32"/>
+                <w:lang w:val="vi-VN"/>
+              </w:rPr>
+            </m:ctrlPr>
+          </m:sSubPr>
+          <m:e>
+            <m:r>
+              <w:rPr>
+                <w:rFonts w:ascii="Cambria Math" w:hAnsi="Cambria Math" w:cs="Times New Roman"/>
+                <w:sz w:val="32"/>
+                <w:szCs w:val="32"/>
+                <w:lang w:val="vi-VN"/>
+              </w:rPr>
+              <m:t>F</m:t>
+            </m:r>
+          </m:e>
+          <m:sub>
+            <m:r>
+              <w:rPr>
+                <w:rFonts w:ascii="Cambria Math" w:hAnsi="Cambria Math" w:cs="Times New Roman"/>
+                <w:sz w:val="32"/>
+                <w:szCs w:val="32"/>
+                <w:lang w:val="vi-VN"/>
+              </w:rPr>
+              <m:t>G</m:t>
+            </m:r>
+          </m:sub>
+        </m:sSub>
+        <m:r>
+          <w:rPr>
+            <w:rFonts w:ascii="Cambria Math" w:hAnsi="Cambria Math" w:cs="Times New Roman"/>
+            <w:sz w:val="32"/>
+            <w:szCs w:val="32"/>
+            <w:lang w:val="vi-VN"/>
+          </w:rPr>
+          <m:t>= 0.587</m:t>
+        </m:r>
+        <m:sSub>
+          <m:sSubPr>
+            <m:ctrlPr>
+              <w:rPr>
+                <w:rFonts w:ascii="Cambria Math" w:hAnsi="Cambria Math" w:cs="Times New Roman"/>
+                <w:iCs/>
+                <w:sz w:val="32"/>
+                <w:szCs w:val="32"/>
+                <w:lang w:val="vi-VN"/>
+              </w:rPr>
+            </m:ctrlPr>
+          </m:sSubPr>
+          <m:e>
+            <m:r>
+              <w:rPr>
+                <w:rFonts w:ascii="Cambria Math" w:hAnsi="Cambria Math" w:cs="Times New Roman"/>
+                <w:sz w:val="32"/>
+                <w:szCs w:val="32"/>
+                <w:lang w:val="vi-VN"/>
+              </w:rPr>
+              <m:t>; F</m:t>
+            </m:r>
+          </m:e>
+          <m:sub>
+            <m:r>
+              <w:rPr>
+                <w:rFonts w:ascii="Cambria Math" w:hAnsi="Cambria Math" w:cs="Times New Roman"/>
+                <w:sz w:val="32"/>
+                <w:szCs w:val="32"/>
+                <w:lang w:val="vi-VN"/>
+              </w:rPr>
+              <m:t>R</m:t>
+            </m:r>
+          </m:sub>
+        </m:sSub>
+        <m:r>
+          <w:rPr>
+            <w:rFonts w:ascii="Cambria Math" w:hAnsi="Cambria Math" w:cs="Times New Roman"/>
+            <w:sz w:val="32"/>
+            <w:szCs w:val="32"/>
+            <w:lang w:val="vi-VN"/>
+          </w:rPr>
+          <m:t>= 0.299;</m:t>
+        </m:r>
+        <m:sSub>
+          <m:sSubPr>
+            <m:ctrlPr>
+              <w:rPr>
+                <w:rFonts w:ascii="Cambria Math" w:hAnsi="Cambria Math" w:cs="Times New Roman"/>
+                <w:iCs/>
+                <w:sz w:val="32"/>
+                <w:szCs w:val="32"/>
+                <w:lang w:val="vi-VN"/>
+              </w:rPr>
+            </m:ctrlPr>
+          </m:sSubPr>
+          <m:e>
+            <m:r>
+              <w:rPr>
+                <w:rFonts w:ascii="Cambria Math" w:hAnsi="Cambria Math" w:cs="Times New Roman"/>
+                <w:sz w:val="32"/>
+                <w:szCs w:val="32"/>
+                <w:lang w:val="vi-VN"/>
+              </w:rPr>
+              <m:t>F</m:t>
+            </m:r>
+          </m:e>
+          <m:sub>
+            <m:r>
+              <w:rPr>
+                <w:rFonts w:ascii="Cambria Math" w:hAnsi="Cambria Math" w:cs="Times New Roman"/>
+                <w:sz w:val="32"/>
+                <w:szCs w:val="32"/>
+                <w:lang w:val="vi-VN"/>
+              </w:rPr>
+              <m:t>B</m:t>
+            </m:r>
+          </m:sub>
+        </m:sSub>
+        <m:r>
+          <w:rPr>
+            <w:rFonts w:ascii="Cambria Math" w:hAnsi="Cambria Math" w:cs="Times New Roman"/>
+            <w:sz w:val="32"/>
+            <w:szCs w:val="32"/>
+            <w:lang w:val="vi-VN"/>
+          </w:rPr>
+          <m:t>= 0.114</m:t>
+        </m:r>
+      </m:oMath>
+      <w:r>
+        <w:rPr>
+          <w:rFonts w:ascii="Times New Roman" w:eastAsiaTheme="minorEastAsia" w:hAnsi="Times New Roman" w:cs="Times New Roman"/>
+          <w:iCs/>
+          <w:sz w:val="32"/>
+          <w:szCs w:val="32"/>
+          <w:lang w:val="vi-VN"/>
+        </w:rPr>
+        <w:t xml:space="preserve">  </w:t>
+      </w:r>
+      <w:r>
+        <w:rPr>
+          <w:rFonts w:ascii="Times New Roman" w:eastAsiaTheme="minorEastAsia" w:hAnsi="Times New Roman" w:cs="Times New Roman"/>
+          <w:sz w:val="32"/>
+          <w:szCs w:val="32"/>
+          <w:lang w:val="vi-VN"/>
+        </w:rPr>
+        <w:t xml:space="preserve"> , nhưng như đã viết ở trên,</w:t>
+      </w:r>
+      <w:r>
+        <w:rPr>
+          <w:rFonts w:ascii="Times New Roman" w:eastAsiaTheme="minorEastAsia" w:hAnsi="Times New Roman" w:cs="Times New Roman"/>
+          <w:sz w:val="32"/>
+          <w:szCs w:val="32"/>
+          <w:lang w:val="vi-VN"/>
+        </w:rPr>
+        <w:t xml:space="preserve"> vì Rec. 601 nhạy màu Lục nên ta sẽ đặt</w:t>
+      </w:r>
+      <w:r>
+        <w:rPr>
+          <w:rFonts w:ascii="Times New Roman" w:eastAsiaTheme="minorEastAsia" w:hAnsi="Times New Roman" w:cs="Times New Roman"/>
+          <w:sz w:val="32"/>
+          <w:szCs w:val="32"/>
+          <w:lang w:val="vi-VN"/>
+        </w:rPr>
+        <w:t xml:space="preserve"> </w:t>
+      </w:r>
+      <m:oMath>
+        <m:r>
+          <w:rPr>
+            <w:rFonts w:ascii="Cambria Math" w:hAnsi="Cambria Math" w:cs="Times New Roman"/>
+            <w:sz w:val="32"/>
+            <w:szCs w:val="32"/>
+            <w:lang w:val="vi-VN"/>
+          </w:rPr>
+          <m:t xml:space="preserve">, </m:t>
+        </m:r>
+        <m:sSub>
+          <m:sSubPr>
+            <m:ctrlPr>
+              <w:rPr>
+                <w:rFonts w:ascii="Cambria Math" w:hAnsi="Cambria Math" w:cs="Times New Roman"/>
+                <w:iCs/>
+                <w:sz w:val="32"/>
+                <w:szCs w:val="32"/>
+                <w:lang w:val="vi-VN"/>
+              </w:rPr>
+            </m:ctrlPr>
+          </m:sSubPr>
+          <m:e>
+            <m:r>
+              <w:rPr>
+                <w:rFonts w:ascii="Cambria Math" w:hAnsi="Cambria Math" w:cs="Times New Roman"/>
+                <w:sz w:val="32"/>
+                <w:szCs w:val="32"/>
+                <w:lang w:val="vi-VN"/>
+              </w:rPr>
+              <m:t>F</m:t>
+            </m:r>
+          </m:e>
+          <m:sub>
+            <m:r>
+              <w:rPr>
+                <w:rFonts w:ascii="Cambria Math" w:hAnsi="Cambria Math" w:cs="Times New Roman"/>
+                <w:sz w:val="32"/>
+                <w:szCs w:val="32"/>
+                <w:lang w:val="vi-VN"/>
+              </w:rPr>
+              <m:t>G</m:t>
+            </m:r>
+          </m:sub>
+        </m:sSub>
+        <m:r>
+          <w:rPr>
+            <w:rFonts w:ascii="Cambria Math" w:hAnsi="Cambria Math" w:cs="Times New Roman"/>
+            <w:sz w:val="32"/>
+            <w:szCs w:val="32"/>
+            <w:lang w:val="vi-VN"/>
+          </w:rPr>
+          <m:t>= 1</m:t>
+        </m:r>
+      </m:oMath>
+      <w:r>
+        <w:rPr>
+          <w:rFonts w:ascii="Times New Roman" w:eastAsiaTheme="minorEastAsia" w:hAnsi="Times New Roman" w:cs="Times New Roman"/>
+          <w:sz w:val="32"/>
+          <w:szCs w:val="32"/>
+          <w:lang w:val="vi-VN"/>
+        </w:rPr>
+        <w:t xml:space="preserve"> </w:t>
+      </w:r>
+      <w:r>
+        <w:rPr>
+          <w:rFonts w:ascii="Times New Roman" w:eastAsiaTheme="minorEastAsia" w:hAnsi="Times New Roman" w:cs="Times New Roman"/>
+          <w:sz w:val="32"/>
+          <w:szCs w:val="32"/>
+          <w:lang w:val="vi-VN"/>
+        </w:rPr>
+        <w:t xml:space="preserve">, khi đó </w:t>
+      </w:r>
+      <w:r>
+        <w:rPr>
+          <w:rFonts w:ascii="Cambria Math" w:hAnsi="Cambria Math" w:cs="Times New Roman"/>
+          <w:iCs/>
+          <w:sz w:val="32"/>
+          <w:szCs w:val="32"/>
+          <w:lang w:val="vi-VN"/>
+        </w:rPr>
+        <w:t xml:space="preserve"> </w:t>
+      </w:r>
+      <m:oMath>
+        <m:sSub>
+          <m:sSubPr>
+            <m:ctrlPr>
+              <w:rPr>
+                <w:rFonts w:ascii="Cambria Math" w:hAnsi="Cambria Math" w:cs="Times New Roman"/>
+                <w:iCs/>
+                <w:sz w:val="32"/>
+                <w:szCs w:val="32"/>
+                <w:lang w:val="vi-VN"/>
+              </w:rPr>
+            </m:ctrlPr>
+          </m:sSubPr>
+          <m:e>
+            <m:r>
+              <w:rPr>
+                <w:rFonts w:ascii="Cambria Math" w:hAnsi="Cambria Math" w:cs="Times New Roman"/>
+                <w:sz w:val="32"/>
+                <w:szCs w:val="32"/>
+                <w:lang w:val="vi-VN"/>
+              </w:rPr>
+              <m:t>F</m:t>
+            </m:r>
+          </m:e>
+          <m:sub>
+            <m:r>
+              <w:rPr>
+                <w:rFonts w:ascii="Cambria Math" w:hAnsi="Cambria Math" w:cs="Times New Roman"/>
+                <w:sz w:val="32"/>
+                <w:szCs w:val="32"/>
+                <w:lang w:val="vi-VN"/>
+              </w:rPr>
+              <m:t>R</m:t>
+            </m:r>
+          </m:sub>
+        </m:sSub>
+        <m:r>
+          <w:rPr>
+            <w:rFonts w:ascii="Cambria Math" w:hAnsi="Cambria Math" w:cs="Times New Roman"/>
+            <w:sz w:val="32"/>
+            <w:szCs w:val="32"/>
+            <w:lang w:val="vi-VN"/>
+          </w:rPr>
+          <m:t xml:space="preserve">= </m:t>
+        </m:r>
+        <m:f>
+          <m:fPr>
+            <m:ctrlPr>
+              <w:rPr>
+                <w:rFonts w:ascii="Cambria Math" w:hAnsi="Cambria Math" w:cs="Times New Roman"/>
+                <w:i/>
+                <w:sz w:val="32"/>
+                <w:szCs w:val="32"/>
+                <w:lang w:val="vi-VN"/>
+              </w:rPr>
+            </m:ctrlPr>
+          </m:fPr>
+          <m:num>
+            <m:r>
+              <w:rPr>
+                <w:rFonts w:ascii="Cambria Math" w:hAnsi="Cambria Math" w:cs="Times New Roman"/>
+                <w:sz w:val="32"/>
+                <w:szCs w:val="32"/>
+                <w:lang w:val="vi-VN"/>
+              </w:rPr>
+              <m:t>0.299</m:t>
+            </m:r>
+          </m:num>
+          <m:den>
+            <m:r>
+              <w:rPr>
+                <w:rFonts w:ascii="Cambria Math" w:hAnsi="Cambria Math" w:cs="Times New Roman"/>
+                <w:sz w:val="32"/>
+                <w:szCs w:val="32"/>
+                <w:lang w:val="vi-VN"/>
+              </w:rPr>
+              <m:t>0.587</m:t>
+            </m:r>
+          </m:den>
+        </m:f>
+        <m:r>
+          <w:rPr>
+            <w:rFonts w:ascii="Cambria Math" w:hAnsi="Cambria Math" w:cs="Times New Roman"/>
+            <w:sz w:val="32"/>
+            <w:szCs w:val="32"/>
+            <w:lang w:val="vi-VN"/>
+          </w:rPr>
+          <m:t xml:space="preserve"> ≈0.509;</m:t>
+        </m:r>
+        <m:sSub>
+          <m:sSubPr>
+            <m:ctrlPr>
+              <w:rPr>
+                <w:rFonts w:ascii="Cambria Math" w:hAnsi="Cambria Math" w:cs="Times New Roman"/>
+                <w:iCs/>
+                <w:sz w:val="32"/>
+                <w:szCs w:val="32"/>
+                <w:lang w:val="vi-VN"/>
+              </w:rPr>
+            </m:ctrlPr>
+          </m:sSubPr>
+          <m:e>
+            <m:r>
+              <w:rPr>
+                <w:rFonts w:ascii="Cambria Math" w:hAnsi="Cambria Math" w:cs="Times New Roman"/>
+                <w:sz w:val="32"/>
+                <w:szCs w:val="32"/>
+                <w:lang w:val="vi-VN"/>
+              </w:rPr>
+              <m:t>F</m:t>
+            </m:r>
+          </m:e>
+          <m:sub>
+            <m:r>
+              <w:rPr>
+                <w:rFonts w:ascii="Cambria Math" w:hAnsi="Cambria Math" w:cs="Times New Roman"/>
+                <w:sz w:val="32"/>
+                <w:szCs w:val="32"/>
+                <w:lang w:val="vi-VN"/>
+              </w:rPr>
+              <m:t>B</m:t>
+            </m:r>
+          </m:sub>
+        </m:sSub>
+        <m:r>
+          <w:rPr>
+            <w:rFonts w:ascii="Cambria Math" w:hAnsi="Cambria Math" w:cs="Times New Roman"/>
+            <w:sz w:val="32"/>
+            <w:szCs w:val="32"/>
+            <w:lang w:val="vi-VN"/>
+          </w:rPr>
+          <m:t xml:space="preserve">= </m:t>
+        </m:r>
+        <m:f>
+          <m:fPr>
+            <m:ctrlPr>
+              <w:rPr>
+                <w:rFonts w:ascii="Cambria Math" w:hAnsi="Cambria Math" w:cs="Times New Roman"/>
+                <w:i/>
+                <w:sz w:val="32"/>
+                <w:szCs w:val="32"/>
+                <w:lang w:val="vi-VN"/>
+              </w:rPr>
+            </m:ctrlPr>
+          </m:fPr>
+          <m:num>
+            <m:r>
+              <w:rPr>
+                <w:rFonts w:ascii="Cambria Math" w:hAnsi="Cambria Math" w:cs="Times New Roman"/>
+                <w:sz w:val="32"/>
+                <w:szCs w:val="32"/>
+                <w:lang w:val="vi-VN"/>
+              </w:rPr>
+              <m:t>0.114</m:t>
+            </m:r>
+          </m:num>
+          <m:den>
+            <m:r>
+              <w:rPr>
+                <w:rFonts w:ascii="Cambria Math" w:hAnsi="Cambria Math" w:cs="Times New Roman"/>
+                <w:sz w:val="32"/>
+                <w:szCs w:val="32"/>
+                <w:lang w:val="vi-VN"/>
+              </w:rPr>
+              <m:t>0.587</m:t>
+            </m:r>
+          </m:den>
+        </m:f>
+        <m:r>
+          <w:rPr>
+            <w:rFonts w:ascii="Cambria Math" w:hAnsi="Cambria Math" w:cs="Times New Roman"/>
+            <w:sz w:val="32"/>
+            <w:szCs w:val="32"/>
+            <w:lang w:val="vi-VN"/>
+          </w:rPr>
+          <m:t xml:space="preserve"> ≈0.194 </m:t>
+        </m:r>
+      </m:oMath>
+      <w:r>
+        <w:rPr>
+          <w:rFonts w:ascii="Cambria Math" w:eastAsiaTheme="minorEastAsia" w:hAnsi="Cambria Math" w:cs="Times New Roman"/>
+          <w:sz w:val="32"/>
+          <w:szCs w:val="32"/>
+          <w:lang w:val="vi-VN"/>
+        </w:rPr>
+        <w:t xml:space="preserve"> </w:t>
+      </w:r>
+      <w:r>
+        <w:rPr>
+          <w:rFonts w:ascii="Times New Roman" w:eastAsiaTheme="minorEastAsia" w:hAnsi="Times New Roman" w:cs="Times New Roman"/>
+          <w:sz w:val="32"/>
+          <w:szCs w:val="32"/>
+          <w:lang w:val="vi-VN"/>
+        </w:rPr>
+        <w:t>)</w:t>
+      </w:r>
+    </w:p>
+    <w:p>
+      <w:pPr>
+        <w:rPr>
+          <w:rFonts w:ascii="Times New Roman" w:hAnsi="Times New Roman" w:cs="Times New Roman"/>
           <w:sz w:val="32"/>
           <w:szCs w:val="32"/>
           <w:lang w:val="vi-VN"/>
@@ -1915,7 +3316,7 @@
               <w:szCs w:val="32"/>
               <w:lang w:val="vi-VN"/>
             </w:rPr>
-            <m:t>L=min(</m:t>
+            <m:t>L=max(</m:t>
           </m:r>
           <m:d>
             <m:dPr>
@@ -2566,240 +3967,906 @@
           <w:szCs w:val="32"/>
           <w:lang w:val="vi-VN"/>
         </w:rPr>
-        <w:t xml:space="preserve"> tùy theo chuẩn ảnh ( đối với phim </w:t>
-      </w:r>
-      <w:r>
-        <w:rPr>
-          <w:rFonts w:ascii="Times New Roman" w:hAnsi="Times New Roman" w:cs="Times New Roman"/>
-          <w:sz w:val="32"/>
-          <w:szCs w:val="32"/>
-          <w:lang w:val="vi-VN"/>
-        </w:rPr>
-        <w:t>Orth</w:t>
-      </w:r>
-      <w:r>
-        <w:rPr>
-          <w:rFonts w:ascii="Times New Roman" w:hAnsi="Times New Roman" w:cs="Times New Roman"/>
-          <w:sz w:val="32"/>
-          <w:szCs w:val="32"/>
-          <w:lang w:val="vi-VN"/>
-        </w:rPr>
-        <w:t xml:space="preserve">ochromatic thì </w:t>
+        <w:t xml:space="preserve"> tùy theo chuẩn </w:t>
+      </w:r>
+      <w:r>
+        <w:rPr>
+          <w:rFonts w:ascii="Times New Roman" w:eastAsiaTheme="minorEastAsia" w:hAnsi="Times New Roman" w:cs="Times New Roman"/>
+          <w:iCs/>
+          <w:sz w:val="32"/>
+          <w:szCs w:val="32"/>
+          <w:lang w:val="vi-VN"/>
+        </w:rPr>
+        <w:t>ảnh.</w:t>
+      </w:r>
+    </w:p>
+    <w:p>
+      <w:pPr>
+        <w:rPr>
+          <w:rFonts w:ascii="Times New Roman" w:eastAsiaTheme="minorEastAsia" w:hAnsi="Times New Roman" w:cs="Times New Roman"/>
+          <w:iCs/>
+          <w:sz w:val="32"/>
+          <w:szCs w:val="32"/>
+          <w:lang w:val="vi-VN"/>
+        </w:rPr>
+      </w:pPr>
+      <w:r>
+        <w:rPr>
+          <w:rFonts w:ascii="Times New Roman" w:eastAsiaTheme="minorEastAsia" w:hAnsi="Times New Roman" w:cs="Times New Roman"/>
+          <w:iCs/>
+          <w:sz w:val="32"/>
+          <w:szCs w:val="32"/>
+          <w:lang w:val="vi-VN"/>
+        </w:rPr>
+        <w:t>L là kênh màu chung sau khi sửa</w:t>
+      </w:r>
+    </w:p>
+    <w:p>
+      <w:pPr>
+        <w:rPr>
+          <w:rFonts w:ascii="Times New Roman" w:eastAsiaTheme="minorEastAsia" w:hAnsi="Times New Roman" w:cs="Times New Roman"/>
+          <w:iCs/>
+          <w:sz w:val="32"/>
+          <w:szCs w:val="32"/>
+          <w:lang w:val="vi-VN"/>
+        </w:rPr>
+      </w:pPr>
+      <w:r>
+        <w:rPr>
+          <w:rFonts w:ascii="Times New Roman" w:eastAsiaTheme="minorEastAsia" w:hAnsi="Times New Roman" w:cs="Times New Roman"/>
+          <w:iCs/>
+          <w:sz w:val="32"/>
+          <w:szCs w:val="32"/>
+          <w:lang w:val="vi-VN"/>
+        </w:rPr>
+        <w:t xml:space="preserve">Sau đó ta thu </w:t>
+      </w:r>
+      <w:r>
+        <w:rPr>
+          <w:rFonts w:ascii="Times New Roman" w:eastAsiaTheme="minorEastAsia" w:hAnsi="Times New Roman" w:cs="Times New Roman"/>
+          <w:iCs/>
+          <w:sz w:val="32"/>
+          <w:szCs w:val="32"/>
+          <w:lang w:val="vi-VN"/>
+        </w:rPr>
+        <w:t xml:space="preserve">được màu mới là </w:t>
+      </w:r>
+      <w:r>
+        <w:rPr>
+          <w:rFonts w:ascii="Times New Roman" w:eastAsiaTheme="minorEastAsia" w:hAnsi="Times New Roman" w:cs="Times New Roman"/>
+          <w:iCs/>
+          <w:sz w:val="32"/>
+          <w:szCs w:val="32"/>
+          <w:lang w:val="vi-VN"/>
+        </w:rPr>
+        <w:t>(L,L,L)</w:t>
+      </w:r>
+      <w:r>
+        <w:rPr>
+          <w:rFonts w:ascii="Times New Roman" w:eastAsiaTheme="minorEastAsia" w:hAnsi="Times New Roman" w:cs="Times New Roman"/>
+          <w:iCs/>
+          <w:sz w:val="32"/>
+          <w:szCs w:val="32"/>
+          <w:lang w:val="vi-VN"/>
+        </w:rPr>
+        <w:t>, với 3 kênh màu bằng nhau và bằng với L.</w:t>
+      </w:r>
+    </w:p>
+    <w:p>
+      <w:pPr>
+        <w:rPr>
+          <w:rFonts w:ascii="Times New Roman" w:hAnsi="Times New Roman" w:cs="Times New Roman"/>
+          <w:sz w:val="40"/>
+          <w:szCs w:val="40"/>
+          <w:lang w:val="vi-VN"/>
+        </w:rPr>
+      </w:pPr>
+      <w:r>
+        <w:rPr>
+          <w:rFonts w:ascii="Times New Roman" w:hAnsi="Times New Roman" w:cs="Times New Roman"/>
+          <w:sz w:val="40"/>
+          <w:szCs w:val="40"/>
+          <w:lang w:val="vi-VN"/>
+        </w:rPr>
+        <w:t xml:space="preserve">Phần </w:t>
+      </w:r>
+      <w:r>
+        <w:rPr>
+          <w:rFonts w:ascii="Times New Roman" w:hAnsi="Times New Roman" w:cs="Times New Roman"/>
+          <w:sz w:val="40"/>
+          <w:szCs w:val="40"/>
+          <w:lang w:val="vi-VN"/>
+        </w:rPr>
+        <w:t>3</w:t>
+      </w:r>
+      <w:r>
+        <w:rPr>
+          <w:rFonts w:ascii="Times New Roman" w:hAnsi="Times New Roman" w:cs="Times New Roman"/>
+          <w:sz w:val="40"/>
+          <w:szCs w:val="40"/>
+          <w:lang w:val="vi-VN"/>
+        </w:rPr>
+        <w:t xml:space="preserve">. Thuật toán </w:t>
+      </w:r>
+      <w:r>
+        <w:rPr>
+          <w:rFonts w:ascii="Times New Roman" w:hAnsi="Times New Roman" w:cs="Times New Roman"/>
+          <w:sz w:val="40"/>
+          <w:szCs w:val="40"/>
+          <w:lang w:val="vi-VN"/>
+        </w:rPr>
+        <w:t xml:space="preserve">phóng </w:t>
+      </w:r>
+      <w:r>
+        <w:rPr>
+          <w:rFonts w:ascii="Times New Roman" w:hAnsi="Times New Roman" w:cs="Times New Roman"/>
+          <w:sz w:val="40"/>
+          <w:szCs w:val="40"/>
+          <w:lang w:val="vi-VN"/>
+        </w:rPr>
+        <w:t>to, thu nhỏ</w:t>
+      </w:r>
+      <w:r>
+        <w:rPr>
+          <w:rFonts w:ascii="Times New Roman" w:hAnsi="Times New Roman" w:cs="Times New Roman"/>
+          <w:sz w:val="40"/>
+          <w:szCs w:val="40"/>
+          <w:lang w:val="vi-VN"/>
+        </w:rPr>
+        <w:t xml:space="preserve"> hiển thị</w:t>
+      </w:r>
+      <w:r>
+        <w:rPr>
+          <w:rFonts w:ascii="Times New Roman" w:hAnsi="Times New Roman" w:cs="Times New Roman"/>
+          <w:sz w:val="40"/>
+          <w:szCs w:val="40"/>
+          <w:lang w:val="vi-VN"/>
+        </w:rPr>
+        <w:t xml:space="preserve"> hình ảnh</w:t>
+      </w:r>
+    </w:p>
+    <w:p>
+      <w:pPr>
+        <w:rPr>
+          <w:rFonts w:ascii="Times New Roman" w:hAnsi="Times New Roman" w:cs="Times New Roman"/>
+          <w:b/>
+          <w:bCs/>
+          <w:sz w:val="32"/>
+          <w:szCs w:val="32"/>
+          <w:lang w:val="vi-VN"/>
+        </w:rPr>
+      </w:pPr>
+      <w:r>
+        <w:rPr>
+          <w:rFonts w:ascii="Times New Roman" w:hAnsi="Times New Roman" w:cs="Times New Roman"/>
+          <w:b/>
+          <w:bCs/>
+          <w:sz w:val="32"/>
+          <w:szCs w:val="32"/>
+          <w:lang w:val="vi-VN"/>
+        </w:rPr>
+        <w:t xml:space="preserve">I. </w:t>
+      </w:r>
+      <w:r>
+        <w:rPr>
+          <w:rFonts w:ascii="Times New Roman" w:hAnsi="Times New Roman" w:cs="Times New Roman"/>
+          <w:b/>
+          <w:bCs/>
+          <w:sz w:val="32"/>
+          <w:szCs w:val="32"/>
+          <w:lang w:val="vi-VN"/>
+        </w:rPr>
+        <w:t>Nhu cầu</w:t>
+      </w:r>
+    </w:p>
+    <w:p>
+      <w:pPr>
+        <w:rPr>
+          <w:rFonts w:ascii="Times New Roman" w:eastAsiaTheme="minorEastAsia" w:hAnsi="Times New Roman" w:cs="Times New Roman"/>
+          <w:iCs/>
+          <w:sz w:val="32"/>
+          <w:szCs w:val="32"/>
+          <w:lang w:val="vi-VN"/>
+        </w:rPr>
+      </w:pPr>
+      <w:r>
+        <w:rPr>
+          <w:rFonts w:ascii="Times New Roman" w:eastAsiaTheme="minorEastAsia" w:hAnsi="Times New Roman" w:cs="Times New Roman"/>
+          <w:iCs/>
+          <w:sz w:val="32"/>
+          <w:szCs w:val="32"/>
+          <w:lang w:val="vi-VN"/>
+        </w:rPr>
+        <w:t>Để phần mềm hoạt động phụ thuộc rất lớn vào thao tác của người dùng.</w:t>
+      </w:r>
+      <w:r>
+        <w:rPr>
+          <w:rFonts w:ascii="Times New Roman" w:eastAsiaTheme="minorEastAsia" w:hAnsi="Times New Roman" w:cs="Times New Roman"/>
+          <w:iCs/>
+          <w:sz w:val="32"/>
+          <w:szCs w:val="32"/>
+          <w:lang w:val="vi-VN"/>
+        </w:rPr>
+        <w:t xml:space="preserve"> </w:t>
+      </w:r>
+      <w:r>
+        <w:rPr>
+          <w:rFonts w:ascii="Times New Roman" w:eastAsiaTheme="minorEastAsia" w:hAnsi="Times New Roman" w:cs="Times New Roman"/>
+          <w:iCs/>
+          <w:sz w:val="32"/>
+          <w:szCs w:val="32"/>
+          <w:lang w:val="vi-VN"/>
+        </w:rPr>
+        <w:t xml:space="preserve">Nó đòi hỏi một độ chính xác tới từng Pixel. </w:t>
+      </w:r>
+      <w:r>
+        <w:rPr>
+          <w:rFonts w:ascii="Times New Roman" w:eastAsiaTheme="minorEastAsia" w:hAnsi="Times New Roman" w:cs="Times New Roman"/>
+          <w:iCs/>
+          <w:sz w:val="32"/>
+          <w:szCs w:val="32"/>
+          <w:lang w:val="vi-VN"/>
+        </w:rPr>
+        <w:t xml:space="preserve">Như vậy, thao tác người dùng </w:t>
+      </w:r>
+      <w:r>
+        <w:rPr>
+          <w:rFonts w:ascii="Times New Roman" w:eastAsiaTheme="minorEastAsia" w:hAnsi="Times New Roman" w:cs="Times New Roman"/>
+          <w:iCs/>
+          <w:sz w:val="32"/>
+          <w:szCs w:val="32"/>
+          <w:lang w:val="vi-VN"/>
+        </w:rPr>
+        <w:t>càng</w:t>
+      </w:r>
+      <w:r>
+        <w:rPr>
+          <w:rFonts w:ascii="Times New Roman" w:eastAsiaTheme="minorEastAsia" w:hAnsi="Times New Roman" w:cs="Times New Roman"/>
+          <w:iCs/>
+          <w:sz w:val="32"/>
+          <w:szCs w:val="32"/>
+          <w:lang w:val="vi-VN"/>
+        </w:rPr>
+        <w:t xml:space="preserve"> </w:t>
+      </w:r>
+      <w:r>
+        <w:rPr>
+          <w:rFonts w:ascii="Times New Roman" w:eastAsiaTheme="minorEastAsia" w:hAnsi="Times New Roman" w:cs="Times New Roman"/>
+          <w:iCs/>
+          <w:sz w:val="32"/>
+          <w:szCs w:val="32"/>
+          <w:lang w:val="vi-VN"/>
+        </w:rPr>
+        <w:t xml:space="preserve">chính xác, phần mềm hoạt động càng tốt. </w:t>
+      </w:r>
+      <w:r>
+        <w:rPr>
+          <w:rFonts w:ascii="Times New Roman" w:eastAsiaTheme="minorEastAsia" w:hAnsi="Times New Roman" w:cs="Times New Roman"/>
+          <w:iCs/>
+          <w:sz w:val="32"/>
+          <w:szCs w:val="32"/>
+          <w:lang w:val="vi-VN"/>
+        </w:rPr>
+        <w:t xml:space="preserve">Để làm được điều </w:t>
+      </w:r>
+      <w:r>
+        <w:rPr>
+          <w:rFonts w:ascii="Times New Roman" w:eastAsiaTheme="minorEastAsia" w:hAnsi="Times New Roman" w:cs="Times New Roman"/>
+          <w:iCs/>
+          <w:sz w:val="32"/>
+          <w:szCs w:val="32"/>
+          <w:lang w:val="vi-VN"/>
+        </w:rPr>
+        <w:t xml:space="preserve">đó, cần có một thuật toán cho các thao tác phóng to/ thu nhỏ ảnh, nhằm giúp người dùng thao tác </w:t>
+      </w:r>
+      <w:r>
+        <w:rPr>
+          <w:rFonts w:ascii="Times New Roman" w:eastAsiaTheme="minorEastAsia" w:hAnsi="Times New Roman" w:cs="Times New Roman"/>
+          <w:iCs/>
+          <w:sz w:val="32"/>
+          <w:szCs w:val="32"/>
+          <w:lang w:val="vi-VN"/>
+        </w:rPr>
+        <w:t>chuẩn xác hơn.</w:t>
+      </w:r>
+    </w:p>
+    <w:p>
+      <w:pPr>
+        <w:rPr>
+          <w:rFonts w:ascii="Times New Roman" w:hAnsi="Times New Roman" w:cs="Times New Roman"/>
+          <w:b/>
+          <w:bCs/>
+          <w:sz w:val="32"/>
+          <w:szCs w:val="32"/>
+          <w:lang w:val="vi-VN"/>
+        </w:rPr>
+      </w:pPr>
+      <w:r>
+        <w:rPr>
+          <w:rFonts w:ascii="Times New Roman" w:hAnsi="Times New Roman" w:cs="Times New Roman"/>
+          <w:b/>
+          <w:bCs/>
+          <w:sz w:val="32"/>
+          <w:szCs w:val="32"/>
+          <w:lang w:val="vi-VN"/>
+        </w:rPr>
+        <w:t>II. Ý tưởng</w:t>
+      </w:r>
+    </w:p>
+    <w:p>
+      <w:pPr>
+        <w:rPr>
+          <w:rFonts w:ascii="Times New Roman" w:eastAsiaTheme="minorEastAsia" w:hAnsi="Times New Roman" w:cs="Times New Roman"/>
+          <w:iCs/>
+          <w:sz w:val="32"/>
+          <w:szCs w:val="32"/>
+          <w:lang w:val="vi-VN"/>
+        </w:rPr>
+      </w:pPr>
+      <w:r>
+        <w:rPr>
+          <w:rFonts w:ascii="Times New Roman" w:eastAsiaTheme="minorEastAsia" w:hAnsi="Times New Roman" w:cs="Times New Roman"/>
+          <w:iCs/>
+          <w:sz w:val="32"/>
+          <w:szCs w:val="32"/>
+          <w:lang w:val="vi-VN"/>
+        </w:rPr>
+        <w:t>Ý tưởng như sau</w:t>
+      </w:r>
+      <w:r>
+        <w:rPr>
+          <w:rFonts w:ascii="Times New Roman" w:eastAsiaTheme="minorEastAsia" w:hAnsi="Times New Roman" w:cs="Times New Roman"/>
+          <w:iCs/>
+          <w:sz w:val="32"/>
+          <w:szCs w:val="32"/>
+          <w:lang w:val="vi-VN"/>
+        </w:rPr>
+        <w:t xml:space="preserve"> : </w:t>
+      </w:r>
+      <w:r>
+        <w:rPr>
+          <w:rFonts w:ascii="Times New Roman" w:eastAsiaTheme="minorEastAsia" w:hAnsi="Times New Roman" w:cs="Times New Roman"/>
+          <w:iCs/>
+          <w:sz w:val="32"/>
+          <w:szCs w:val="32"/>
+          <w:lang w:val="vi-VN"/>
+        </w:rPr>
+        <w:br/>
+      </w:r>
+      <w:r>
+        <w:rPr>
+          <w:rFonts w:ascii="Times New Roman" w:eastAsiaTheme="minorEastAsia" w:hAnsi="Times New Roman" w:cs="Times New Roman"/>
+          <w:iCs/>
+          <w:sz w:val="32"/>
+          <w:szCs w:val="32"/>
+          <w:lang w:val="vi-VN"/>
+        </w:rPr>
+        <w:t xml:space="preserve">Gọi </w:t>
       </w:r>
       <m:oMath>
-        <m:sSub>
-          <m:sSubPr>
-            <m:ctrlPr>
-              <w:rPr>
-                <w:rFonts w:ascii="Cambria Math" w:hAnsi="Cambria Math" w:cs="Times New Roman"/>
-                <w:iCs/>
-                <w:sz w:val="32"/>
-                <w:szCs w:val="32"/>
-                <w:lang w:val="vi-VN"/>
-              </w:rPr>
-            </m:ctrlPr>
-          </m:sSubPr>
-          <m:e>
-            <m:r>
-              <w:rPr>
-                <w:rFonts w:ascii="Cambria Math" w:hAnsi="Cambria Math" w:cs="Times New Roman"/>
-                <w:sz w:val="32"/>
-                <w:szCs w:val="32"/>
-                <w:lang w:val="vi-VN"/>
-              </w:rPr>
-              <m:t>F</m:t>
-            </m:r>
-          </m:e>
-          <m:sub>
-            <m:r>
-              <w:rPr>
-                <w:rFonts w:ascii="Cambria Math" w:hAnsi="Cambria Math" w:cs="Times New Roman"/>
-                <w:sz w:val="32"/>
-                <w:szCs w:val="32"/>
-                <w:lang w:val="vi-VN"/>
-              </w:rPr>
-              <m:t>R</m:t>
-            </m:r>
-          </m:sub>
-        </m:sSub>
         <m:r>
           <w:rPr>
-            <w:rFonts w:ascii="Cambria Math" w:hAnsi="Cambria Math" w:cs="Times New Roman"/>
+            <w:rFonts w:ascii="Cambria Math" w:eastAsiaTheme="minorEastAsia" w:hAnsi="Cambria Math" w:cs="Times New Roman"/>
             <w:sz w:val="32"/>
             <w:szCs w:val="32"/>
             <w:lang w:val="vi-VN"/>
           </w:rPr>
-          <m:t xml:space="preserve">= </m:t>
+          <m:t xml:space="preserve">k (k </m:t>
         </m:r>
-        <m:sSub>
-          <m:sSubPr>
-            <m:ctrlPr>
-              <w:rPr>
-                <w:rFonts w:ascii="Cambria Math" w:hAnsi="Cambria Math" w:cs="Times New Roman"/>
-                <w:iCs/>
-                <w:sz w:val="32"/>
-                <w:szCs w:val="32"/>
-                <w:lang w:val="vi-VN"/>
-              </w:rPr>
-            </m:ctrlPr>
-          </m:sSubPr>
-          <m:e>
-            <m:r>
-              <w:rPr>
-                <w:rFonts w:ascii="Cambria Math" w:hAnsi="Cambria Math" w:cs="Times New Roman"/>
-                <w:sz w:val="32"/>
-                <w:szCs w:val="32"/>
-                <w:lang w:val="vi-VN"/>
-              </w:rPr>
-              <m:t>F</m:t>
-            </m:r>
-          </m:e>
-          <m:sub>
-            <m:r>
-              <w:rPr>
-                <w:rFonts w:ascii="Cambria Math" w:hAnsi="Cambria Math" w:cs="Times New Roman"/>
-                <w:sz w:val="32"/>
-                <w:szCs w:val="32"/>
-                <w:lang w:val="vi-VN"/>
-              </w:rPr>
-              <m:t>G</m:t>
-            </m:r>
-          </m:sub>
-        </m:sSub>
         <m:r>
           <w:rPr>
-            <w:rFonts w:ascii="Cambria Math" w:hAnsi="Cambria Math" w:cs="Times New Roman"/>
+            <w:rFonts w:ascii="Cambria Math" w:eastAsiaTheme="minorEastAsia" w:hAnsi="Cambria Math" w:cs="Times New Roman"/>
             <w:sz w:val="32"/>
             <w:szCs w:val="32"/>
             <w:lang w:val="vi-VN"/>
           </w:rPr>
-          <m:t>=</m:t>
+          <m:t xml:space="preserve">ϵ </m:t>
         </m:r>
-        <m:sSub>
-          <m:sSubPr>
-            <m:ctrlPr>
-              <w:rPr>
-                <w:rFonts w:ascii="Cambria Math" w:hAnsi="Cambria Math" w:cs="Times New Roman"/>
-                <w:iCs/>
-                <w:sz w:val="32"/>
-                <w:szCs w:val="32"/>
-                <w:lang w:val="vi-VN"/>
-              </w:rPr>
-            </m:ctrlPr>
-          </m:sSubPr>
-          <m:e>
-            <m:r>
-              <w:rPr>
-                <w:rFonts w:ascii="Cambria Math" w:hAnsi="Cambria Math" w:cs="Times New Roman"/>
-                <w:sz w:val="32"/>
-                <w:szCs w:val="32"/>
-                <w:lang w:val="vi-VN"/>
-              </w:rPr>
-              <m:t>F</m:t>
-            </m:r>
-          </m:e>
-          <m:sub>
-            <m:r>
-              <w:rPr>
-                <w:rFonts w:ascii="Cambria Math" w:hAnsi="Cambria Math" w:cs="Times New Roman"/>
-                <w:sz w:val="32"/>
-                <w:szCs w:val="32"/>
-                <w:lang w:val="vi-VN"/>
-              </w:rPr>
-              <m:t>B</m:t>
-            </m:r>
-          </m:sub>
-        </m:sSub>
         <m:r>
+          <m:rPr>
+            <m:scr m:val="double-struck"/>
+          </m:rPr>
           <w:rPr>
-            <w:rFonts w:ascii="Cambria Math" w:hAnsi="Cambria Math" w:cs="Times New Roman"/>
+            <w:rFonts w:ascii="Cambria Math" w:eastAsiaTheme="minorEastAsia" w:hAnsi="Cambria Math" w:cs="Times New Roman"/>
             <w:sz w:val="32"/>
             <w:szCs w:val="32"/>
             <w:lang w:val="vi-VN"/>
           </w:rPr>
-          <m:t>=1</m:t>
+          <m:t>N</m:t>
+        </m:r>
+        <m:r>
+          <w:rPr>
+            <w:rFonts w:ascii="Cambria Math" w:eastAsiaTheme="minorEastAsia" w:hAnsi="Cambria Math" w:cs="Times New Roman"/>
+            <w:sz w:val="32"/>
+            <w:szCs w:val="32"/>
+          </w:rPr>
+          <m:t>, k&gt;0)</m:t>
         </m:r>
       </m:oMath>
       <w:r>
         <w:rPr>
-          <w:rFonts w:ascii="Times New Roman" w:hAnsi="Times New Roman" w:cs="Times New Roman"/>
-          <w:sz w:val="32"/>
-          <w:szCs w:val="32"/>
-          <w:lang w:val="vi-VN"/>
-        </w:rPr>
-        <w:t>)</w:t>
-      </w:r>
-    </w:p>
-    <w:p>
-      <w:pPr>
-        <w:rPr>
-          <w:rFonts w:ascii="Times New Roman" w:eastAsiaTheme="minorEastAsia" w:hAnsi="Times New Roman" w:cs="Times New Roman"/>
-          <w:iCs/>
-          <w:sz w:val="32"/>
-          <w:szCs w:val="32"/>
-          <w:lang w:val="vi-VN"/>
-        </w:rPr>
-      </w:pPr>
-      <w:r>
-        <w:rPr>
-          <w:rFonts w:ascii="Times New Roman" w:eastAsiaTheme="minorEastAsia" w:hAnsi="Times New Roman" w:cs="Times New Roman"/>
-          <w:iCs/>
-          <w:sz w:val="32"/>
-          <w:szCs w:val="32"/>
-          <w:lang w:val="vi-VN"/>
-        </w:rPr>
-        <w:t>L là kênh màu chung sau khi sửa</w:t>
-      </w:r>
-    </w:p>
-    <w:p>
-      <w:pPr>
-        <w:rPr>
-          <w:rFonts w:ascii="Times New Roman" w:hAnsi="Times New Roman" w:cs="Times New Roman"/>
-          <w:sz w:val="32"/>
-          <w:szCs w:val="32"/>
-          <w:u w:val="single"/>
-          <w:lang w:val="vi-VN"/>
-        </w:rPr>
-      </w:pPr>
-      <w:r>
-        <w:rPr>
-          <w:rFonts w:ascii="Times New Roman" w:eastAsiaTheme="minorEastAsia" w:hAnsi="Times New Roman" w:cs="Times New Roman"/>
-          <w:iCs/>
-          <w:sz w:val="32"/>
-          <w:szCs w:val="32"/>
-          <w:lang w:val="vi-VN"/>
-        </w:rPr>
-        <w:t xml:space="preserve">Sau đó ta thu </w:t>
-      </w:r>
-      <w:r>
-        <w:rPr>
-          <w:rFonts w:ascii="Times New Roman" w:eastAsiaTheme="minorEastAsia" w:hAnsi="Times New Roman" w:cs="Times New Roman"/>
-          <w:iCs/>
-          <w:sz w:val="32"/>
-          <w:szCs w:val="32"/>
-          <w:lang w:val="vi-VN"/>
-        </w:rPr>
-        <w:t xml:space="preserve">được màu mới là </w:t>
-      </w:r>
-      <w:r>
-        <w:rPr>
-          <w:rFonts w:ascii="Times New Roman" w:eastAsiaTheme="minorEastAsia" w:hAnsi="Times New Roman" w:cs="Times New Roman"/>
-          <w:iCs/>
-          <w:sz w:val="32"/>
-          <w:szCs w:val="32"/>
-          <w:lang w:val="vi-VN"/>
-        </w:rPr>
-        <w:t>(L,L,L)</w:t>
-      </w:r>
-      <w:r>
-        <w:rPr>
-          <w:rFonts w:ascii="Times New Roman" w:eastAsiaTheme="minorEastAsia" w:hAnsi="Times New Roman" w:cs="Times New Roman"/>
-          <w:iCs/>
-          <w:sz w:val="32"/>
-          <w:szCs w:val="32"/>
-          <w:lang w:val="vi-VN"/>
-        </w:rPr>
-        <w:t>, với 3 kênh màu bằng nhau và bằng với L.</w:t>
+          <w:rFonts w:ascii="Times New Roman" w:eastAsiaTheme="minorEastAsia" w:hAnsi="Times New Roman" w:cs="Times New Roman"/>
+          <w:iCs/>
+          <w:sz w:val="32"/>
+          <w:szCs w:val="32"/>
+        </w:rPr>
+        <w:t xml:space="preserve"> là</w:t>
+      </w:r>
+      <w:r>
+        <w:rPr>
+          <w:rFonts w:ascii="Times New Roman" w:eastAsiaTheme="minorEastAsia" w:hAnsi="Times New Roman" w:cs="Times New Roman"/>
+          <w:iCs/>
+          <w:sz w:val="32"/>
+          <w:szCs w:val="32"/>
+          <w:lang w:val="vi-VN"/>
+        </w:rPr>
+        <w:t xml:space="preserve"> độ thu phóng của bức ảnh. Tới lúc này, ta cần phân biệt giữa số Pixel ảnh thực tế và số Pixel màn hình hiển thị </w:t>
+      </w:r>
+    </w:p>
+    <w:p>
+      <w:pPr>
+        <w:rPr>
+          <w:rFonts w:ascii="Times New Roman" w:eastAsiaTheme="minorEastAsia" w:hAnsi="Times New Roman" w:cs="Times New Roman"/>
+          <w:iCs/>
+          <w:sz w:val="32"/>
+          <w:szCs w:val="32"/>
+          <w:lang w:val="vi-VN"/>
+        </w:rPr>
+      </w:pPr>
+      <w:r>
+        <w:rPr>
+          <w:rFonts w:ascii="Times New Roman" w:eastAsiaTheme="minorEastAsia" w:hAnsi="Times New Roman" w:cs="Times New Roman"/>
+          <w:iCs/>
+          <w:sz w:val="32"/>
+          <w:szCs w:val="32"/>
+          <w:lang w:val="vi-VN"/>
+        </w:rPr>
+        <w:lastRenderedPageBreak/>
+        <w:t xml:space="preserve">Giả sử ở </w:t>
+      </w:r>
+      <m:oMath>
+        <m:r>
+          <w:rPr>
+            <w:rFonts w:ascii="Cambria Math" w:eastAsiaTheme="minorEastAsia" w:hAnsi="Cambria Math" w:cs="Times New Roman"/>
+            <w:sz w:val="32"/>
+            <w:szCs w:val="32"/>
+            <w:lang w:val="vi-VN"/>
+          </w:rPr>
+          <m:t>k</m:t>
+        </m:r>
+        <m:r>
+          <w:rPr>
+            <w:rFonts w:ascii="Cambria Math" w:eastAsiaTheme="minorEastAsia" w:hAnsi="Cambria Math" w:cs="Times New Roman"/>
+            <w:sz w:val="32"/>
+            <w:szCs w:val="32"/>
+            <w:lang w:val="vi-VN"/>
+          </w:rPr>
+          <m:t>=1,</m:t>
+        </m:r>
+      </m:oMath>
+      <w:r>
+        <w:rPr>
+          <w:rFonts w:ascii="Times New Roman" w:eastAsiaTheme="minorEastAsia" w:hAnsi="Times New Roman" w:cs="Times New Roman"/>
+          <w:iCs/>
+          <w:sz w:val="32"/>
+          <w:szCs w:val="32"/>
+          <w:lang w:val="vi-VN"/>
+        </w:rPr>
+        <w:t xml:space="preserve"> mỗi Pixel ảnh thực tế được hiển thị trên một Pixel của màn hình. </w:t>
+      </w:r>
+    </w:p>
+    <w:p>
+      <w:pPr>
+        <w:rPr>
+          <w:rFonts w:ascii="Times New Roman" w:eastAsiaTheme="minorEastAsia" w:hAnsi="Times New Roman" w:cs="Times New Roman"/>
+          <w:iCs/>
+          <w:sz w:val="32"/>
+          <w:szCs w:val="32"/>
+          <w:lang w:val="vi-VN"/>
+        </w:rPr>
+      </w:pPr>
+      <w:r>
+        <w:rPr>
+          <w:rFonts w:ascii="Times New Roman" w:eastAsiaTheme="minorEastAsia" w:hAnsi="Times New Roman" w:cs="Times New Roman"/>
+          <w:iCs/>
+          <w:sz w:val="32"/>
+          <w:szCs w:val="32"/>
+          <w:lang w:val="vi-VN"/>
+        </w:rPr>
+        <w:t xml:space="preserve">Với </w:t>
+      </w:r>
+      <w:r>
+        <w:rPr>
+          <w:rFonts w:ascii="Times New Roman" w:eastAsiaTheme="minorEastAsia" w:hAnsi="Times New Roman" w:cs="Times New Roman"/>
+          <w:iCs/>
+          <w:sz w:val="32"/>
+          <w:szCs w:val="32"/>
+          <w:lang w:val="vi-VN"/>
+        </w:rPr>
+        <w:t xml:space="preserve">các giá trị k thay đổi, </w:t>
+      </w:r>
+      <w:r>
+        <w:rPr>
+          <w:rFonts w:ascii="Times New Roman" w:eastAsiaTheme="minorEastAsia" w:hAnsi="Times New Roman" w:cs="Times New Roman"/>
+          <w:iCs/>
+          <w:sz w:val="32"/>
+          <w:szCs w:val="32"/>
+          <w:lang w:val="vi-VN"/>
+        </w:rPr>
+        <w:t xml:space="preserve">thì mỗi Pixel ảnh thực tế được hiển thị trên một </w:t>
+      </w:r>
+      <w:r>
+        <w:rPr>
+          <w:rFonts w:ascii="Times New Roman" w:eastAsiaTheme="minorEastAsia" w:hAnsi="Times New Roman" w:cs="Times New Roman"/>
+          <w:iCs/>
+          <w:sz w:val="32"/>
+          <w:szCs w:val="32"/>
+          <w:lang w:val="vi-VN"/>
+        </w:rPr>
+        <w:t xml:space="preserve">hình </w:t>
+      </w:r>
+      <w:r>
+        <w:rPr>
+          <w:rFonts w:ascii="Times New Roman" w:eastAsiaTheme="minorEastAsia" w:hAnsi="Times New Roman" w:cs="Times New Roman"/>
+          <w:iCs/>
+          <w:sz w:val="32"/>
+          <w:szCs w:val="32"/>
+          <w:lang w:val="vi-VN"/>
+        </w:rPr>
+        <w:t xml:space="preserve">vuông </w:t>
+      </w:r>
+      <m:oMath>
+        <m:r>
+          <w:rPr>
+            <w:rFonts w:ascii="Cambria Math" w:eastAsiaTheme="minorEastAsia" w:hAnsi="Cambria Math" w:cs="Times New Roman"/>
+            <w:sz w:val="32"/>
+            <w:szCs w:val="32"/>
+            <w:lang w:val="vi-VN"/>
+          </w:rPr>
+          <m:t>k</m:t>
+        </m:r>
+        <m:r>
+          <w:rPr>
+            <w:rFonts w:ascii="Cambria Math" w:eastAsiaTheme="minorEastAsia" w:hAnsi="Cambria Math" w:cs="Times New Roman"/>
+            <w:sz w:val="32"/>
+            <w:szCs w:val="32"/>
+            <w:lang w:val="vi-VN"/>
+          </w:rPr>
+          <m:t>*k</m:t>
+        </m:r>
+      </m:oMath>
+      <w:r>
+        <w:rPr>
+          <w:rFonts w:ascii="Times New Roman" w:eastAsiaTheme="minorEastAsia" w:hAnsi="Times New Roman" w:cs="Times New Roman"/>
+          <w:iCs/>
+          <w:sz w:val="32"/>
+          <w:szCs w:val="32"/>
+          <w:lang w:val="vi-VN"/>
+        </w:rPr>
+        <w:t xml:space="preserve"> </w:t>
+      </w:r>
+      <w:r>
+        <w:rPr>
+          <w:rFonts w:ascii="Times New Roman" w:eastAsiaTheme="minorEastAsia" w:hAnsi="Times New Roman" w:cs="Times New Roman"/>
+          <w:iCs/>
+          <w:sz w:val="32"/>
+          <w:szCs w:val="32"/>
+          <w:lang w:val="vi-VN"/>
+        </w:rPr>
+        <w:t xml:space="preserve">Pixel màn hình. </w:t>
+      </w:r>
+    </w:p>
+    <w:p>
+      <w:pPr>
+        <w:rPr>
+          <w:rFonts w:ascii="Times New Roman" w:eastAsiaTheme="minorEastAsia" w:hAnsi="Times New Roman" w:cs="Times New Roman"/>
+          <w:iCs/>
+          <w:sz w:val="32"/>
+          <w:szCs w:val="32"/>
+          <w:lang w:val="vi-VN"/>
+        </w:rPr>
+      </w:pPr>
+      <w:r>
+        <w:rPr>
+          <w:rFonts w:ascii="Times New Roman" w:eastAsiaTheme="minorEastAsia" w:hAnsi="Times New Roman" w:cs="Times New Roman"/>
+          <w:iCs/>
+          <w:sz w:val="32"/>
+          <w:szCs w:val="32"/>
+          <w:lang w:val="vi-VN"/>
+        </w:rPr>
+        <w:t xml:space="preserve">Ví dụ, đây là khi </w:t>
+      </w:r>
+      <m:oMath>
+        <m:r>
+          <w:rPr>
+            <w:rFonts w:ascii="Cambria Math" w:eastAsiaTheme="minorEastAsia" w:hAnsi="Cambria Math" w:cs="Times New Roman"/>
+            <w:sz w:val="32"/>
+            <w:szCs w:val="32"/>
+            <w:lang w:val="vi-VN"/>
+          </w:rPr>
+          <m:t>k=1</m:t>
+        </m:r>
+      </m:oMath>
+      <w:r>
+        <w:rPr>
+          <w:rFonts w:ascii="Times New Roman" w:eastAsiaTheme="minorEastAsia" w:hAnsi="Times New Roman" w:cs="Times New Roman"/>
+          <w:iCs/>
+          <w:sz w:val="32"/>
+          <w:szCs w:val="32"/>
+          <w:lang w:val="vi-VN"/>
+        </w:rPr>
+        <w:t xml:space="preserve"> ( mỗi ô vuông là một Pixel màn hình, ô vuông màu đen là 1 Pixel của ảnh thực tế)</w:t>
+      </w:r>
+    </w:p>
+    <w:p>
+      <w:pPr>
+        <w:rPr>
+          <w:rFonts w:ascii="Times New Roman" w:eastAsiaTheme="minorEastAsia" w:hAnsi="Times New Roman" w:cs="Times New Roman"/>
+          <w:i/>
+          <w:iCs/>
+          <w:sz w:val="32"/>
+          <w:szCs w:val="32"/>
+          <w:lang w:val="vi-VN"/>
+        </w:rPr>
+      </w:pPr>
+      <w:r>
+        <w:rPr>
+          <w:rFonts w:ascii="Times New Roman" w:eastAsiaTheme="minorEastAsia" w:hAnsi="Times New Roman" w:cs="Times New Roman"/>
+          <w:i/>
+          <w:iCs/>
+          <w:sz w:val="32"/>
+          <w:szCs w:val="32"/>
+          <w:lang w:val="vi-VN"/>
+        </w:rPr>
+        <w:drawing>
+          <wp:inline distT="0" distB="0" distL="0" distR="0" wp14:anchorId="2CA56422" wp14:editId="5FFF2EA9">
+            <wp:extent cx="790685" cy="800212"/>
+            <wp:effectExtent l="0" t="0" r="0" b="0"/>
+            <wp:docPr id="1" name="Picture 1"/>
+            <wp:cNvGraphicFramePr>
+              <a:graphicFrameLocks xmlns:a="http://schemas.openxmlformats.org/drawingml/2006/main" noChangeAspect="1"/>
+            </wp:cNvGraphicFramePr>
+            <a:graphic xmlns:a="http://schemas.openxmlformats.org/drawingml/2006/main">
+              <a:graphicData uri="http://schemas.openxmlformats.org/drawingml/2006/picture">
+                <pic:pic xmlns:pic="http://schemas.openxmlformats.org/drawingml/2006/picture">
+                  <pic:nvPicPr>
+                    <pic:cNvPr id="1" name=""/>
+                    <pic:cNvPicPr/>
+                  </pic:nvPicPr>
+                  <pic:blipFill>
+                    <a:blip r:embed="rId7"/>
+                    <a:stretch>
+                      <a:fillRect/>
+                    </a:stretch>
+                  </pic:blipFill>
+                  <pic:spPr>
+                    <a:xfrm>
+                      <a:off x="0" y="0"/>
+                      <a:ext cx="790685" cy="800212"/>
+                    </a:xfrm>
+                    <a:prstGeom prst="rect">
+                      <a:avLst/>
+                    </a:prstGeom>
+                  </pic:spPr>
+                </pic:pic>
+              </a:graphicData>
+            </a:graphic>
+          </wp:inline>
+        </w:drawing>
+      </w:r>
+    </w:p>
+    <w:p>
+      <w:pPr>
+        <w:rPr>
+          <w:rFonts w:ascii="Times New Roman" w:eastAsiaTheme="minorEastAsia" w:hAnsi="Times New Roman" w:cs="Times New Roman"/>
+          <w:iCs/>
+          <w:sz w:val="32"/>
+          <w:szCs w:val="32"/>
+          <w:lang w:val="vi-VN"/>
+        </w:rPr>
+      </w:pPr>
+      <w:r>
+        <w:rPr>
+          <w:rFonts w:ascii="Times New Roman" w:eastAsiaTheme="minorEastAsia" w:hAnsi="Times New Roman" w:cs="Times New Roman"/>
+          <w:sz w:val="32"/>
+          <w:szCs w:val="32"/>
+        </w:rPr>
+        <w:t>Với</w:t>
+      </w:r>
+      <w:r>
+        <w:rPr>
+          <w:rFonts w:ascii="Times New Roman" w:eastAsiaTheme="minorEastAsia" w:hAnsi="Times New Roman" w:cs="Times New Roman"/>
+          <w:sz w:val="32"/>
+          <w:szCs w:val="32"/>
+          <w:lang w:val="vi-VN"/>
+        </w:rPr>
+        <w:t xml:space="preserve"> </w:t>
+      </w:r>
+      <m:oMath>
+        <m:r>
+          <w:rPr>
+            <w:rFonts w:ascii="Cambria Math" w:eastAsiaTheme="minorEastAsia" w:hAnsi="Cambria Math" w:cs="Times New Roman"/>
+            <w:sz w:val="32"/>
+            <w:szCs w:val="32"/>
+            <w:lang w:val="vi-VN"/>
+          </w:rPr>
+          <m:t>k=</m:t>
+        </m:r>
+        <m:r>
+          <w:rPr>
+            <w:rFonts w:ascii="Cambria Math" w:eastAsiaTheme="minorEastAsia" w:hAnsi="Cambria Math" w:cs="Times New Roman"/>
+            <w:sz w:val="32"/>
+            <w:szCs w:val="32"/>
+            <w:lang w:val="vi-VN"/>
+          </w:rPr>
+          <m:t>2</m:t>
+        </m:r>
+      </m:oMath>
+      <w:r>
+        <w:rPr>
+          <w:rFonts w:ascii="Times New Roman" w:eastAsiaTheme="minorEastAsia" w:hAnsi="Times New Roman" w:cs="Times New Roman"/>
+          <w:iCs/>
+          <w:sz w:val="32"/>
+          <w:szCs w:val="32"/>
+          <w:lang w:val="vi-VN"/>
+        </w:rPr>
+        <w:t xml:space="preserve"> : </w:t>
+      </w:r>
+    </w:p>
+    <w:p>
+      <w:pPr>
+        <w:rPr>
+          <w:rFonts w:ascii="Times New Roman" w:eastAsiaTheme="minorEastAsia" w:hAnsi="Times New Roman" w:cs="Times New Roman"/>
+          <w:sz w:val="32"/>
+          <w:szCs w:val="32"/>
+          <w:lang w:val="vi-VN"/>
+        </w:rPr>
+      </w:pPr>
+      <w:r>
+        <w:rPr>
+          <w:rFonts w:ascii="Times New Roman" w:eastAsiaTheme="minorEastAsia" w:hAnsi="Times New Roman" w:cs="Times New Roman"/>
+          <w:sz w:val="32"/>
+          <w:szCs w:val="32"/>
+          <w:lang w:val="vi-VN"/>
+        </w:rPr>
+        <w:drawing>
+          <wp:inline distT="0" distB="0" distL="0" distR="0" wp14:anchorId="5BC2D2DB" wp14:editId="5C1FFFD0">
+            <wp:extent cx="771633" cy="781159"/>
+            <wp:effectExtent l="0" t="0" r="9525" b="0"/>
+            <wp:docPr id="2" name="Picture 2"/>
+            <wp:cNvGraphicFramePr>
+              <a:graphicFrameLocks xmlns:a="http://schemas.openxmlformats.org/drawingml/2006/main" noChangeAspect="1"/>
+            </wp:cNvGraphicFramePr>
+            <a:graphic xmlns:a="http://schemas.openxmlformats.org/drawingml/2006/main">
+              <a:graphicData uri="http://schemas.openxmlformats.org/drawingml/2006/picture">
+                <pic:pic xmlns:pic="http://schemas.openxmlformats.org/drawingml/2006/picture">
+                  <pic:nvPicPr>
+                    <pic:cNvPr id="1" name=""/>
+                    <pic:cNvPicPr/>
+                  </pic:nvPicPr>
+                  <pic:blipFill>
+                    <a:blip r:embed="rId8"/>
+                    <a:stretch>
+                      <a:fillRect/>
+                    </a:stretch>
+                  </pic:blipFill>
+                  <pic:spPr>
+                    <a:xfrm>
+                      <a:off x="0" y="0"/>
+                      <a:ext cx="771633" cy="781159"/>
+                    </a:xfrm>
+                    <a:prstGeom prst="rect">
+                      <a:avLst/>
+                    </a:prstGeom>
+                  </pic:spPr>
+                </pic:pic>
+              </a:graphicData>
+            </a:graphic>
+          </wp:inline>
+        </w:drawing>
+      </w:r>
+    </w:p>
+    <w:p>
+      <w:pPr>
+        <w:rPr>
+          <w:rFonts w:ascii="Times New Roman" w:eastAsiaTheme="minorEastAsia" w:hAnsi="Times New Roman" w:cs="Times New Roman"/>
+          <w:iCs/>
+          <w:sz w:val="32"/>
+          <w:szCs w:val="32"/>
+          <w:lang w:val="vi-VN"/>
+        </w:rPr>
+      </w:pPr>
+      <w:r>
+        <w:rPr>
+          <w:rFonts w:ascii="Times New Roman" w:eastAsiaTheme="minorEastAsia" w:hAnsi="Times New Roman" w:cs="Times New Roman"/>
+          <w:sz w:val="32"/>
+          <w:szCs w:val="32"/>
+          <w:lang w:val="vi-VN"/>
+        </w:rPr>
+        <w:t xml:space="preserve">Với </w:t>
+      </w:r>
+      <m:oMath>
+        <m:r>
+          <w:rPr>
+            <w:rFonts w:ascii="Cambria Math" w:eastAsiaTheme="minorEastAsia" w:hAnsi="Cambria Math" w:cs="Times New Roman"/>
+            <w:sz w:val="32"/>
+            <w:szCs w:val="32"/>
+            <w:lang w:val="vi-VN"/>
+          </w:rPr>
+          <m:t>k=</m:t>
+        </m:r>
+        <m:r>
+          <w:rPr>
+            <w:rFonts w:ascii="Cambria Math" w:eastAsiaTheme="minorEastAsia" w:hAnsi="Cambria Math" w:cs="Times New Roman"/>
+            <w:sz w:val="32"/>
+            <w:szCs w:val="32"/>
+            <w:lang w:val="vi-VN"/>
+          </w:rPr>
+          <m:t>3</m:t>
+        </m:r>
+      </m:oMath>
+      <w:r>
+        <w:rPr>
+          <w:rFonts w:ascii="Times New Roman" w:eastAsiaTheme="minorEastAsia" w:hAnsi="Times New Roman" w:cs="Times New Roman"/>
+          <w:iCs/>
+          <w:sz w:val="32"/>
+          <w:szCs w:val="32"/>
+          <w:lang w:val="vi-VN"/>
+        </w:rPr>
+        <w:t xml:space="preserve"> :</w:t>
+      </w:r>
+    </w:p>
+    <w:p>
+      <w:pPr>
+        <w:rPr>
+          <w:rFonts w:ascii="Times New Roman" w:eastAsiaTheme="minorEastAsia" w:hAnsi="Times New Roman" w:cs="Times New Roman"/>
+          <w:sz w:val="32"/>
+          <w:szCs w:val="32"/>
+          <w:lang w:val="vi-VN"/>
+        </w:rPr>
+      </w:pPr>
+      <w:r>
+        <w:rPr>
+          <w:rFonts w:ascii="Times New Roman" w:eastAsiaTheme="minorEastAsia" w:hAnsi="Times New Roman" w:cs="Times New Roman"/>
+          <w:sz w:val="32"/>
+          <w:szCs w:val="32"/>
+          <w:lang w:val="vi-VN"/>
+        </w:rPr>
+        <w:drawing>
+          <wp:inline distT="0" distB="0" distL="0" distR="0" wp14:anchorId="6C462305" wp14:editId="59BA5A52">
+            <wp:extent cx="781159" cy="781159"/>
+            <wp:effectExtent l="0" t="0" r="0" b="0"/>
+            <wp:docPr id="3" name="Picture 3"/>
+            <wp:cNvGraphicFramePr>
+              <a:graphicFrameLocks xmlns:a="http://schemas.openxmlformats.org/drawingml/2006/main" noChangeAspect="1"/>
+            </wp:cNvGraphicFramePr>
+            <a:graphic xmlns:a="http://schemas.openxmlformats.org/drawingml/2006/main">
+              <a:graphicData uri="http://schemas.openxmlformats.org/drawingml/2006/picture">
+                <pic:pic xmlns:pic="http://schemas.openxmlformats.org/drawingml/2006/picture">
+                  <pic:nvPicPr>
+                    <pic:cNvPr id="1" name=""/>
+                    <pic:cNvPicPr/>
+                  </pic:nvPicPr>
+                  <pic:blipFill>
+                    <a:blip r:embed="rId9"/>
+                    <a:stretch>
+                      <a:fillRect/>
+                    </a:stretch>
+                  </pic:blipFill>
+                  <pic:spPr>
+                    <a:xfrm>
+                      <a:off x="0" y="0"/>
+                      <a:ext cx="781159" cy="781159"/>
+                    </a:xfrm>
+                    <a:prstGeom prst="rect">
+                      <a:avLst/>
+                    </a:prstGeom>
+                  </pic:spPr>
+                </pic:pic>
+              </a:graphicData>
+            </a:graphic>
+          </wp:inline>
+        </w:drawing>
       </w:r>
     </w:p>
     <w:p>
@@ -2918,26 +4985,62 @@
           <w:szCs w:val="32"/>
           <w:lang w:val="vi-VN"/>
         </w:rPr>
-        <w:t>2. stb_image (đọc ảnh)</w:t>
-      </w:r>
-    </w:p>
-    <w:p>
-      <w:pPr>
-        <w:rPr>
-          <w:rFonts w:ascii="Times New Roman" w:hAnsi="Times New Roman" w:cs="Times New Roman"/>
-          <w:sz w:val="32"/>
-          <w:szCs w:val="32"/>
-          <w:lang w:val="vi-VN"/>
-        </w:rPr>
-      </w:pPr>
-      <w:r>
-        <w:rPr>
-          <w:rFonts w:ascii="Times New Roman" w:hAnsi="Times New Roman" w:cs="Times New Roman"/>
-          <w:sz w:val="32"/>
-          <w:szCs w:val="32"/>
-          <w:lang w:val="vi-VN"/>
-        </w:rPr>
-        <w:t>3.stb_image_write (ghi ảnh)</w:t>
+        <w:t xml:space="preserve">2. </w:t>
+      </w:r>
+      <w:r>
+        <w:rPr>
+          <w:rFonts w:ascii="Consolas" w:hAnsi="Consolas" w:cs="Times New Roman"/>
+          <w:sz w:val="32"/>
+          <w:szCs w:val="32"/>
+          <w:lang w:val="vi-VN"/>
+        </w:rPr>
+        <w:t>stb_image</w:t>
+      </w:r>
+      <w:r>
+        <w:rPr>
+          <w:rFonts w:ascii="Times New Roman" w:hAnsi="Times New Roman" w:cs="Times New Roman"/>
+          <w:sz w:val="32"/>
+          <w:szCs w:val="32"/>
+          <w:lang w:val="vi-VN"/>
+        </w:rPr>
+        <w:t xml:space="preserve"> (đọc ảnh)</w:t>
+      </w:r>
+    </w:p>
+    <w:p>
+      <w:pPr>
+        <w:rPr>
+          <w:rFonts w:ascii="Times New Roman" w:hAnsi="Times New Roman" w:cs="Times New Roman"/>
+          <w:sz w:val="32"/>
+          <w:szCs w:val="32"/>
+          <w:lang w:val="vi-VN"/>
+        </w:rPr>
+      </w:pPr>
+      <w:r>
+        <w:rPr>
+          <w:rFonts w:ascii="Times New Roman" w:hAnsi="Times New Roman" w:cs="Times New Roman"/>
+          <w:sz w:val="32"/>
+          <w:szCs w:val="32"/>
+          <w:lang w:val="vi-VN"/>
+        </w:rPr>
+        <w:t>3.</w:t>
+      </w:r>
+      <w:r>
+        <w:rPr>
+          <w:rFonts w:ascii="Consolas" w:hAnsi="Consolas" w:cs="Times New Roman"/>
+          <w:sz w:val="32"/>
+          <w:szCs w:val="32"/>
+          <w:lang w:val="vi-VN"/>
+        </w:rPr>
+        <w:t>stb_image_write</w:t>
+      </w:r>
+      <w:r>
+        <w:rPr>
+          <w:rFonts w:ascii="Times New Roman" w:hAnsi="Times New Roman" w:cs="Times New Roman"/>
+          <w:sz w:val="32"/>
+          <w:szCs w:val="32"/>
+          <w:lang w:val="vi-VN"/>
+        </w:rPr>
+        <w:t xml:space="preserve"> (ghi ảnh)</w:t>
       </w:r>
     </w:p>
     <w:p>
@@ -2963,7 +5066,7 @@
       </w:r>
       <w:r>
         <w:rPr>
-          <w:rFonts w:ascii="Times New Roman" w:hAnsi="Times New Roman" w:cs="Times New Roman"/>
+          <w:rFonts w:ascii="Consolas" w:hAnsi="Consolas" w:cs="Times New Roman"/>
           <w:sz w:val="32"/>
           <w:szCs w:val="32"/>
           <w:lang w:val="vi-VN"/>
@@ -2997,7 +5100,6 @@
           <w:szCs w:val="44"/>
           <w:lang w:val="vi-VN"/>
         </w:rPr>
-        <w:lastRenderedPageBreak/>
         <w:t xml:space="preserve">Chương </w:t>
       </w:r>
       <w:r>
@@ -3041,21 +5143,42 @@
     <w:p>
       <w:pPr>
         <w:rPr>
-          <w:rFonts w:ascii="Times New Roman" w:hAnsi="Times New Roman" w:cs="Times New Roman"/>
-          <w:sz w:val="32"/>
-          <w:szCs w:val="32"/>
-          <w:lang w:val="vi-VN"/>
-        </w:rPr>
-      </w:pPr>
-      <w:r>
-        <w:rPr>
-          <w:rFonts w:ascii="Times New Roman" w:hAnsi="Times New Roman" w:cs="Times New Roman"/>
-          <w:sz w:val="32"/>
-          <w:szCs w:val="32"/>
-          <w:lang w:val="vi-VN"/>
-        </w:rPr>
+          <w:rFonts w:ascii="Arial" w:hAnsi="Arial" w:cs="Arial"/>
+          <w:sz w:val="32"/>
+          <w:szCs w:val="32"/>
+          <w:lang w:val="vi-VN"/>
+        </w:rPr>
+      </w:pPr>
+      <w:r>
+        <w:rPr>
+          <w:rFonts w:ascii="Times New Roman" w:hAnsi="Times New Roman" w:cs="Times New Roman"/>
+          <w:sz w:val="32"/>
+          <w:szCs w:val="32"/>
+          <w:lang w:val="vi-VN"/>
+        </w:rPr>
+        <w:lastRenderedPageBreak/>
         <w:br/>
       </w:r>
+    </w:p>
+    <w:p>
+      <w:pPr>
+        <w:rPr>
+          <w:rStyle w:val="Hyperlink"/>
+          <w:rFonts w:ascii="Times New Roman" w:hAnsi="Times New Roman" w:cs="Times New Roman"/>
+          <w:sz w:val="32"/>
+          <w:szCs w:val="32"/>
+          <w:lang w:val="vi-VN"/>
+        </w:rPr>
+      </w:pPr>
+      <w:r>
+        <w:rPr>
+          <w:rFonts w:ascii="Arial" w:hAnsi="Arial" w:cs="Arial"/>
+          <w:sz w:val="32"/>
+          <w:szCs w:val="32"/>
+          <w:lang w:val="vi-VN"/>
+        </w:rPr>
+        <w:t xml:space="preserve">NGUỒN TÀI LIỆU : </w:t>
+      </w:r>
       <w:r>
         <w:rPr>
           <w:rFonts w:ascii="Times New Roman" w:hAnsi="Times New Roman" w:cs="Times New Roman"/>
@@ -3065,6 +5188,40 @@
         </w:rPr>
         <w:br/>
       </w:r>
+      <w:hyperlink r:id="rId10" w:history="1">
+        <w:r>
+          <w:rPr>
+            <w:rStyle w:val="Hyperlink"/>
+            <w:rFonts w:ascii="Times New Roman" w:hAnsi="Times New Roman" w:cs="Times New Roman"/>
+            <w:sz w:val="32"/>
+            <w:szCs w:val="32"/>
+            <w:lang w:val="vi-VN"/>
+          </w:rPr>
+          <w:t>https://filmphotography.eu/vi/phim/phim-den-trang/orthochromatic/</w:t>
+        </w:r>
+      </w:hyperlink>
+    </w:p>
+    <w:p>
+      <w:pPr>
+        <w:rPr>
+          <w:rFonts w:ascii="Times New Roman" w:hAnsi="Times New Roman" w:cs="Times New Roman"/>
+          <w:sz w:val="32"/>
+          <w:szCs w:val="32"/>
+          <w:lang w:val="vi-VN"/>
+        </w:rPr>
+      </w:pPr>
+      <w:hyperlink r:id="rId11" w:history="1">
+        <w:r>
+          <w:rPr>
+            <w:rStyle w:val="Hyperlink"/>
+            <w:rFonts w:ascii="Times New Roman" w:hAnsi="Times New Roman" w:cs="Times New Roman"/>
+            <w:sz w:val="32"/>
+            <w:szCs w:val="32"/>
+            <w:lang w:val="vi-VN"/>
+          </w:rPr>
+          <w:t>https://vi.wikipedia.org/wiki/YCbCr</w:t>
+        </w:r>
+      </w:hyperlink>
     </w:p>
     <w:sectPr>
       <w:pgSz w:w="12240" w:h="15840"/>
@@ -3622,6 +5779,18 @@
       <w:shd w:val="clear" w:color="auto" w:fill="E1DFDD"/>
     </w:rPr>
   </w:style>
+  <w:style w:type="character" w:styleId="FollowedHyperlink">
+    <w:name w:val="FollowedHyperlink"/>
+    <w:basedOn w:val="DefaultParagraphFont"/>
+    <w:uiPriority w:val="99"/>
+    <w:semiHidden/>
+    <w:unhideWhenUsed/>
+    <w:rsid w:val="008F7E8A"/>
+    <w:rPr>
+      <w:color w:val="954F72" w:themeColor="followedHyperlink"/>
+      <w:u w:val="single"/>
+    </w:rPr>
+  </w:style>
 </w:styles>
 </file>
 

</xml_diff>